<commit_message>
update SRS doc file
</commit_message>
<xml_diff>
--- a/documentation/srs/SRS.docx
+++ b/documentation/srs/SRS.docx
@@ -198,7 +198,7 @@
       <w:pPr>
         <w:numPr>
           <w:ilvl w:val="0"/>
-          <w:numId w:val="19"/>
+          <w:numId w:val="20"/>
         </w:numPr>
         <w:ind w:left="720" w:hanging="360"/>
       </w:pPr>
@@ -213,7 +213,7 @@
       <w:pPr>
         <w:numPr>
           <w:ilvl w:val="0"/>
-          <w:numId w:val="19"/>
+          <w:numId w:val="20"/>
         </w:numPr>
         <w:ind w:left="720" w:hanging="360"/>
       </w:pPr>
@@ -228,7 +228,7 @@
       <w:pPr>
         <w:numPr>
           <w:ilvl w:val="0"/>
-          <w:numId w:val="19"/>
+          <w:numId w:val="20"/>
         </w:numPr>
         <w:ind w:left="720" w:hanging="360"/>
       </w:pPr>
@@ -243,7 +243,7 @@
       <w:pPr>
         <w:numPr>
           <w:ilvl w:val="0"/>
-          <w:numId w:val="19"/>
+          <w:numId w:val="20"/>
         </w:numPr>
         <w:ind w:left="720" w:hanging="360"/>
       </w:pPr>
@@ -258,7 +258,7 @@
       <w:pPr>
         <w:numPr>
           <w:ilvl w:val="0"/>
-          <w:numId w:val="19"/>
+          <w:numId w:val="20"/>
         </w:numPr>
         <w:ind w:left="720" w:hanging="360"/>
       </w:pPr>
@@ -325,7 +325,7 @@
       <w:pPr>
         <w:numPr>
           <w:ilvl w:val="0"/>
-          <w:numId w:val="7"/>
+          <w:numId w:val="5"/>
         </w:numPr>
         <w:ind w:left="720" w:hanging="360"/>
         <w:rPr>
@@ -346,7 +346,7 @@
       <w:pPr>
         <w:numPr>
           <w:ilvl w:val="1"/>
-          <w:numId w:val="7"/>
+          <w:numId w:val="5"/>
         </w:numPr>
         <w:ind w:left="1440" w:hanging="360"/>
       </w:pPr>
@@ -361,7 +361,7 @@
       <w:pPr>
         <w:numPr>
           <w:ilvl w:val="1"/>
-          <w:numId w:val="7"/>
+          <w:numId w:val="5"/>
         </w:numPr>
         <w:ind w:left="1440" w:hanging="360"/>
       </w:pPr>
@@ -376,7 +376,7 @@
       <w:pPr>
         <w:numPr>
           <w:ilvl w:val="1"/>
-          <w:numId w:val="7"/>
+          <w:numId w:val="5"/>
         </w:numPr>
         <w:ind w:left="1440" w:hanging="360"/>
       </w:pPr>
@@ -391,7 +391,7 @@
       <w:pPr>
         <w:numPr>
           <w:ilvl w:val="0"/>
-          <w:numId w:val="7"/>
+          <w:numId w:val="5"/>
         </w:numPr>
         <w:ind w:left="720" w:hanging="360"/>
         <w:rPr>
@@ -412,7 +412,7 @@
       <w:pPr>
         <w:numPr>
           <w:ilvl w:val="1"/>
-          <w:numId w:val="7"/>
+          <w:numId w:val="5"/>
         </w:numPr>
         <w:ind w:left="1440" w:hanging="360"/>
       </w:pPr>
@@ -427,7 +427,7 @@
       <w:pPr>
         <w:numPr>
           <w:ilvl w:val="1"/>
-          <w:numId w:val="7"/>
+          <w:numId w:val="5"/>
         </w:numPr>
         <w:ind w:left="1440" w:hanging="360"/>
       </w:pPr>
@@ -442,7 +442,7 @@
       <w:pPr>
         <w:numPr>
           <w:ilvl w:val="1"/>
-          <w:numId w:val="7"/>
+          <w:numId w:val="5"/>
         </w:numPr>
         <w:ind w:left="1440" w:hanging="360"/>
       </w:pPr>
@@ -457,7 +457,7 @@
       <w:pPr>
         <w:numPr>
           <w:ilvl w:val="0"/>
-          <w:numId w:val="7"/>
+          <w:numId w:val="5"/>
         </w:numPr>
         <w:ind w:left="720" w:hanging="360"/>
         <w:rPr>
@@ -478,7 +478,7 @@
       <w:pPr>
         <w:numPr>
           <w:ilvl w:val="1"/>
-          <w:numId w:val="7"/>
+          <w:numId w:val="5"/>
         </w:numPr>
         <w:ind w:left="1440" w:hanging="360"/>
       </w:pPr>
@@ -493,7 +493,7 @@
       <w:pPr>
         <w:numPr>
           <w:ilvl w:val="1"/>
-          <w:numId w:val="7"/>
+          <w:numId w:val="5"/>
         </w:numPr>
         <w:ind w:left="1440" w:hanging="360"/>
       </w:pPr>
@@ -508,7 +508,7 @@
       <w:pPr>
         <w:numPr>
           <w:ilvl w:val="0"/>
-          <w:numId w:val="7"/>
+          <w:numId w:val="5"/>
         </w:numPr>
         <w:ind w:left="720" w:hanging="360"/>
         <w:rPr>
@@ -529,7 +529,7 @@
       <w:pPr>
         <w:numPr>
           <w:ilvl w:val="1"/>
-          <w:numId w:val="7"/>
+          <w:numId w:val="5"/>
         </w:numPr>
         <w:ind w:left="1440" w:hanging="360"/>
       </w:pPr>
@@ -618,7 +618,7 @@
       <w:pPr>
         <w:numPr>
           <w:ilvl w:val="0"/>
-          <w:numId w:val="12"/>
+          <w:numId w:val="10"/>
         </w:numPr>
         <w:ind w:left="720" w:hanging="360"/>
       </w:pPr>
@@ -633,7 +633,7 @@
       <w:pPr>
         <w:numPr>
           <w:ilvl w:val="0"/>
-          <w:numId w:val="12"/>
+          <w:numId w:val="10"/>
         </w:numPr>
         <w:ind w:left="720" w:hanging="360"/>
       </w:pPr>
@@ -648,7 +648,7 @@
       <w:pPr>
         <w:numPr>
           <w:ilvl w:val="0"/>
-          <w:numId w:val="12"/>
+          <w:numId w:val="10"/>
         </w:numPr>
         <w:ind w:left="720" w:hanging="360"/>
       </w:pPr>
@@ -663,7 +663,7 @@
       <w:pPr>
         <w:numPr>
           <w:ilvl w:val="0"/>
-          <w:numId w:val="12"/>
+          <w:numId w:val="10"/>
         </w:numPr>
         <w:ind w:left="720" w:hanging="360"/>
       </w:pPr>
@@ -678,7 +678,7 @@
       <w:pPr>
         <w:numPr>
           <w:ilvl w:val="0"/>
-          <w:numId w:val="12"/>
+          <w:numId w:val="10"/>
         </w:numPr>
         <w:ind w:left="720" w:hanging="360"/>
       </w:pPr>
@@ -693,7 +693,7 @@
       <w:pPr>
         <w:numPr>
           <w:ilvl w:val="0"/>
-          <w:numId w:val="12"/>
+          <w:numId w:val="10"/>
         </w:numPr>
         <w:ind w:left="720" w:hanging="360"/>
       </w:pPr>
@@ -708,7 +708,7 @@
       <w:pPr>
         <w:numPr>
           <w:ilvl w:val="0"/>
-          <w:numId w:val="12"/>
+          <w:numId w:val="10"/>
         </w:numPr>
         <w:ind w:left="720" w:hanging="360"/>
       </w:pPr>
@@ -723,7 +723,7 @@
       <w:pPr>
         <w:numPr>
           <w:ilvl w:val="0"/>
-          <w:numId w:val="12"/>
+          <w:numId w:val="10"/>
         </w:numPr>
         <w:ind w:left="720" w:hanging="360"/>
       </w:pPr>
@@ -789,7 +789,7 @@
       <w:pPr>
         <w:numPr>
           <w:ilvl w:val="0"/>
-          <w:numId w:val="8"/>
+          <w:numId w:val="6"/>
         </w:numPr>
         <w:ind w:left="720" w:hanging="360"/>
       </w:pPr>
@@ -804,7 +804,7 @@
       <w:pPr>
         <w:numPr>
           <w:ilvl w:val="0"/>
-          <w:numId w:val="8"/>
+          <w:numId w:val="6"/>
         </w:numPr>
         <w:ind w:left="720" w:hanging="360"/>
       </w:pPr>
@@ -819,7 +819,7 @@
       <w:pPr>
         <w:numPr>
           <w:ilvl w:val="0"/>
-          <w:numId w:val="8"/>
+          <w:numId w:val="6"/>
         </w:numPr>
         <w:ind w:left="720" w:hanging="360"/>
       </w:pPr>
@@ -834,7 +834,7 @@
       <w:pPr>
         <w:numPr>
           <w:ilvl w:val="0"/>
-          <w:numId w:val="8"/>
+          <w:numId w:val="6"/>
         </w:numPr>
         <w:ind w:left="720" w:hanging="360"/>
       </w:pPr>
@@ -860,7 +860,7 @@
       <w:pPr>
         <w:numPr>
           <w:ilvl w:val="0"/>
-          <w:numId w:val="6"/>
+          <w:numId w:val="4"/>
         </w:numPr>
         <w:ind w:left="720" w:hanging="360"/>
         <w:rPr>
@@ -881,7 +881,7 @@
       <w:pPr>
         <w:numPr>
           <w:ilvl w:val="0"/>
-          <w:numId w:val="6"/>
+          <w:numId w:val="4"/>
         </w:numPr>
         <w:ind w:left="720" w:hanging="360"/>
         <w:rPr>
@@ -902,7 +902,7 @@
       <w:pPr>
         <w:numPr>
           <w:ilvl w:val="0"/>
-          <w:numId w:val="6"/>
+          <w:numId w:val="4"/>
         </w:numPr>
         <w:ind w:left="720" w:hanging="360"/>
         <w:rPr>
@@ -1004,7 +1004,7 @@
       <w:pPr>
         <w:numPr>
           <w:ilvl w:val="0"/>
-          <w:numId w:val="17"/>
+          <w:numId w:val="16"/>
         </w:numPr>
         <w:ind w:left="720" w:hanging="360"/>
       </w:pPr>
@@ -1019,7 +1019,7 @@
       <w:pPr>
         <w:numPr>
           <w:ilvl w:val="0"/>
-          <w:numId w:val="17"/>
+          <w:numId w:val="16"/>
         </w:numPr>
         <w:ind w:left="720" w:hanging="360"/>
       </w:pPr>
@@ -1034,7 +1034,7 @@
       <w:pPr>
         <w:numPr>
           <w:ilvl w:val="0"/>
-          <w:numId w:val="17"/>
+          <w:numId w:val="16"/>
         </w:numPr>
         <w:ind w:left="720" w:hanging="360"/>
       </w:pPr>
@@ -1049,7 +1049,7 @@
       <w:pPr>
         <w:numPr>
           <w:ilvl w:val="0"/>
-          <w:numId w:val="17"/>
+          <w:numId w:val="16"/>
         </w:numPr>
         <w:ind w:left="720" w:hanging="360"/>
       </w:pPr>
@@ -1064,7 +1064,7 @@
       <w:pPr>
         <w:numPr>
           <w:ilvl w:val="0"/>
-          <w:numId w:val="17"/>
+          <w:numId w:val="16"/>
         </w:numPr>
         <w:ind w:left="720" w:hanging="360"/>
       </w:pPr>
@@ -1079,7 +1079,7 @@
       <w:pPr>
         <w:numPr>
           <w:ilvl w:val="0"/>
-          <w:numId w:val="17"/>
+          <w:numId w:val="16"/>
         </w:numPr>
         <w:ind w:left="720" w:hanging="360"/>
       </w:pPr>
@@ -1094,7 +1094,7 @@
       <w:pPr>
         <w:numPr>
           <w:ilvl w:val="0"/>
-          <w:numId w:val="17"/>
+          <w:numId w:val="16"/>
         </w:numPr>
         <w:ind w:left="720" w:hanging="360"/>
       </w:pPr>
@@ -1165,7 +1165,7 @@
       <w:pPr>
         <w:numPr>
           <w:ilvl w:val="0"/>
-          <w:numId w:val="14"/>
+          <w:numId w:val="12"/>
         </w:numPr>
         <w:ind w:left="720" w:hanging="360"/>
       </w:pPr>
@@ -1180,7 +1180,7 @@
       <w:pPr>
         <w:numPr>
           <w:ilvl w:val="0"/>
-          <w:numId w:val="14"/>
+          <w:numId w:val="12"/>
         </w:numPr>
         <w:ind w:left="720" w:hanging="360"/>
       </w:pPr>
@@ -1195,7 +1195,7 @@
       <w:pPr>
         <w:numPr>
           <w:ilvl w:val="0"/>
-          <w:numId w:val="14"/>
+          <w:numId w:val="12"/>
         </w:numPr>
         <w:ind w:left="720" w:hanging="360"/>
       </w:pPr>
@@ -1210,7 +1210,7 @@
       <w:pPr>
         <w:numPr>
           <w:ilvl w:val="0"/>
-          <w:numId w:val="14"/>
+          <w:numId w:val="12"/>
         </w:numPr>
         <w:ind w:left="720" w:hanging="360"/>
       </w:pPr>
@@ -1225,7 +1225,7 @@
       <w:pPr>
         <w:numPr>
           <w:ilvl w:val="0"/>
-          <w:numId w:val="14"/>
+          <w:numId w:val="12"/>
         </w:numPr>
         <w:ind w:left="720" w:hanging="360"/>
       </w:pPr>
@@ -1240,7 +1240,7 @@
       <w:pPr>
         <w:numPr>
           <w:ilvl w:val="0"/>
-          <w:numId w:val="14"/>
+          <w:numId w:val="12"/>
         </w:numPr>
         <w:ind w:left="720" w:hanging="360"/>
       </w:pPr>
@@ -1320,7 +1320,7 @@
       <w:pPr>
         <w:numPr>
           <w:ilvl w:val="0"/>
-          <w:numId w:val="5"/>
+          <w:numId w:val="3"/>
         </w:numPr>
         <w:ind w:left="720" w:hanging="360"/>
       </w:pPr>
@@ -1335,7 +1335,7 @@
       <w:pPr>
         <w:numPr>
           <w:ilvl w:val="0"/>
-          <w:numId w:val="5"/>
+          <w:numId w:val="3"/>
         </w:numPr>
         <w:ind w:left="720" w:hanging="360"/>
       </w:pPr>
@@ -1350,7 +1350,7 @@
       <w:pPr>
         <w:numPr>
           <w:ilvl w:val="0"/>
-          <w:numId w:val="5"/>
+          <w:numId w:val="3"/>
         </w:numPr>
         <w:ind w:left="720" w:hanging="360"/>
       </w:pPr>
@@ -1365,7 +1365,7 @@
       <w:pPr>
         <w:numPr>
           <w:ilvl w:val="0"/>
-          <w:numId w:val="5"/>
+          <w:numId w:val="3"/>
         </w:numPr>
         <w:ind w:left="720" w:hanging="360"/>
       </w:pPr>
@@ -1380,7 +1380,7 @@
       <w:pPr>
         <w:numPr>
           <w:ilvl w:val="0"/>
-          <w:numId w:val="5"/>
+          <w:numId w:val="3"/>
         </w:numPr>
         <w:ind w:left="720" w:hanging="360"/>
       </w:pPr>
@@ -1413,12 +1413,12 @@
           <wp:inline distB="114300" distT="114300" distL="114300" distR="114300">
             <wp:extent cx="5731200" cy="3098800"/>
             <wp:effectExtent b="12700" l="12700" r="12700" t="12700"/>
-            <wp:docPr id="1" name="image2.png"/>
+            <wp:docPr id="1" name="image1.png"/>
             <a:graphic>
               <a:graphicData uri="http://schemas.openxmlformats.org/drawingml/2006/picture">
                 <pic:pic>
                   <pic:nvPicPr>
-                    <pic:cNvPr id="0" name="image2.png"/>
+                    <pic:cNvPr id="0" name="image1.png"/>
                     <pic:cNvPicPr preferRelativeResize="0"/>
                   </pic:nvPicPr>
                   <pic:blipFill>
@@ -1585,7 +1585,7 @@
       <w:pPr>
         <w:numPr>
           <w:ilvl w:val="0"/>
-          <w:numId w:val="9"/>
+          <w:numId w:val="7"/>
         </w:numPr>
         <w:ind w:left="720" w:hanging="360"/>
       </w:pPr>
@@ -1600,7 +1600,7 @@
       <w:pPr>
         <w:numPr>
           <w:ilvl w:val="0"/>
-          <w:numId w:val="9"/>
+          <w:numId w:val="7"/>
         </w:numPr>
         <w:ind w:left="720" w:hanging="360"/>
       </w:pPr>
@@ -1615,7 +1615,7 @@
       <w:pPr>
         <w:numPr>
           <w:ilvl w:val="0"/>
-          <w:numId w:val="9"/>
+          <w:numId w:val="7"/>
         </w:numPr>
         <w:ind w:left="720" w:hanging="360"/>
       </w:pPr>
@@ -1630,7 +1630,7 @@
       <w:pPr>
         <w:numPr>
           <w:ilvl w:val="0"/>
-          <w:numId w:val="9"/>
+          <w:numId w:val="7"/>
         </w:numPr>
         <w:ind w:left="720" w:hanging="360"/>
       </w:pPr>
@@ -1645,7 +1645,7 @@
       <w:pPr>
         <w:numPr>
           <w:ilvl w:val="0"/>
-          <w:numId w:val="9"/>
+          <w:numId w:val="7"/>
         </w:numPr>
         <w:ind w:left="720" w:hanging="360"/>
       </w:pPr>
@@ -1660,7 +1660,7 @@
       <w:pPr>
         <w:numPr>
           <w:ilvl w:val="0"/>
-          <w:numId w:val="9"/>
+          <w:numId w:val="7"/>
         </w:numPr>
         <w:ind w:left="720" w:hanging="360"/>
       </w:pPr>
@@ -1711,12 +1711,12 @@
           <wp:inline distB="114300" distT="114300" distL="114300" distR="114300">
             <wp:extent cx="5731200" cy="3390900"/>
             <wp:effectExtent b="12700" l="12700" r="12700" t="12700"/>
-            <wp:docPr id="2" name="image1.png"/>
+            <wp:docPr id="2" name="image2.png"/>
             <a:graphic>
               <a:graphicData uri="http://schemas.openxmlformats.org/drawingml/2006/picture">
                 <pic:pic>
                   <pic:nvPicPr>
-                    <pic:cNvPr id="0" name="image1.png"/>
+                    <pic:cNvPr id="0" name="image2.png"/>
                     <pic:cNvPicPr preferRelativeResize="0"/>
                   </pic:nvPicPr>
                   <pic:blipFill>
@@ -2299,38 +2299,139 @@
     <w:p>
       <w:pPr>
         <w:pStyle w:val="Heading2"/>
-        <w:rPr/>
-      </w:pPr>
-      <w:bookmarkStart w:colFirst="0" w:colLast="0" w:name="_eo4bysd7w4hw" w:id="15"/>
+        <w:spacing w:after="160" w:lineRule="auto"/>
+        <w:rPr/>
+      </w:pPr>
+      <w:bookmarkStart w:colFirst="0" w:colLast="0" w:name="_lpa5bbg204y3" w:id="15"/>
       <w:bookmarkEnd w:id="15"/>
       <w:r>
         <w:rPr>
           <w:rtl w:val="0"/>
         </w:rPr>
-        <w:t xml:space="preserve">FR-2 Static Application Security Testing (SAST)</w:t>
-      </w:r>
-    </w:p>
-    <w:p>
-      <w:pPr>
-        <w:rPr/>
-      </w:pPr>
-      <w:r>
-        <w:rPr>
-          <w:rtl w:val="0"/>
-        </w:rPr>
-        <w:t xml:space="preserve">The system shall run static security scanning (e.g., Bandit) on source code and produce structured findings.</w:t>
-      </w:r>
-    </w:p>
-    <w:p>
-      <w:pPr>
-        <w:rPr/>
-      </w:pPr>
-      <w:r>
-        <w:rPr>
-          <w:rtl w:val="0"/>
-        </w:rPr>
-        <w:t xml:space="preserve"> </w:t>
-      </w:r>
+        <w:t xml:space="preserve">FR-2 SBOM Minimum Data Fields</w:t>
+      </w:r>
+    </w:p>
+    <w:p>
+      <w:pPr>
+        <w:rPr/>
+      </w:pPr>
+      <w:r>
+        <w:rPr>
+          <w:rtl w:val="0"/>
+        </w:rPr>
+        <w:t xml:space="preserve">The generated SBOM shall include, at minimum:</w:t>
+      </w:r>
+    </w:p>
+    <w:p>
+      <w:pPr>
+        <w:numPr>
+          <w:ilvl w:val="0"/>
+          <w:numId w:val="19"/>
+        </w:numPr>
+        <w:ind w:left="720" w:hanging="360"/>
+      </w:pPr>
+      <w:r>
+        <w:rPr>
+          <w:rtl w:val="0"/>
+        </w:rPr>
+        <w:t xml:space="preserve">Supplier name</w:t>
+      </w:r>
+    </w:p>
+    <w:p>
+      <w:pPr>
+        <w:numPr>
+          <w:ilvl w:val="0"/>
+          <w:numId w:val="19"/>
+        </w:numPr>
+        <w:ind w:left="720" w:hanging="360"/>
+      </w:pPr>
+      <w:r>
+        <w:rPr>
+          <w:rtl w:val="0"/>
+        </w:rPr>
+        <w:t xml:space="preserve">Component name</w:t>
+      </w:r>
+    </w:p>
+    <w:p>
+      <w:pPr>
+        <w:numPr>
+          <w:ilvl w:val="0"/>
+          <w:numId w:val="19"/>
+        </w:numPr>
+        <w:ind w:left="720" w:hanging="360"/>
+      </w:pPr>
+      <w:r>
+        <w:rPr>
+          <w:rtl w:val="0"/>
+        </w:rPr>
+        <w:t xml:space="preserve">Component version</w:t>
+      </w:r>
+    </w:p>
+    <w:p>
+      <w:pPr>
+        <w:numPr>
+          <w:ilvl w:val="0"/>
+          <w:numId w:val="19"/>
+        </w:numPr>
+        <w:ind w:left="720" w:hanging="360"/>
+      </w:pPr>
+      <w:r>
+        <w:rPr>
+          <w:rtl w:val="0"/>
+        </w:rPr>
+        <w:t xml:space="preserve">Unique identifiers (e.g., CPE, PURL)</w:t>
+      </w:r>
+    </w:p>
+    <w:p>
+      <w:pPr>
+        <w:numPr>
+          <w:ilvl w:val="0"/>
+          <w:numId w:val="19"/>
+        </w:numPr>
+        <w:ind w:left="720" w:hanging="360"/>
+      </w:pPr>
+      <w:r>
+        <w:rPr>
+          <w:rtl w:val="0"/>
+        </w:rPr>
+        <w:t xml:space="preserve">Dependency relationships (including transitive dependencies)</w:t>
+      </w:r>
+    </w:p>
+    <w:p>
+      <w:pPr>
+        <w:numPr>
+          <w:ilvl w:val="0"/>
+          <w:numId w:val="19"/>
+        </w:numPr>
+        <w:ind w:left="720" w:hanging="360"/>
+      </w:pPr>
+      <w:r>
+        <w:rPr>
+          <w:rtl w:val="0"/>
+        </w:rPr>
+        <w:t xml:space="preserve">Author of SBOM data</w:t>
+      </w:r>
+    </w:p>
+    <w:p>
+      <w:pPr>
+        <w:numPr>
+          <w:ilvl w:val="0"/>
+          <w:numId w:val="19"/>
+        </w:numPr>
+        <w:ind w:left="720" w:hanging="360"/>
+      </w:pPr>
+      <w:r>
+        <w:rPr>
+          <w:rtl w:val="0"/>
+        </w:rPr>
+        <w:t xml:space="preserve">Timestamp of SBOM generation</w:t>
+      </w:r>
+    </w:p>
+    <w:p>
+      <w:pPr>
+        <w:spacing w:after="160" w:lineRule="auto"/>
+        <w:rPr/>
+      </w:pPr>
       <w:r>
         <w:pict>
           <v:rect style="width:0.0pt;height:1.5pt" o:hr="t" o:hrstd="t" o:hralign="center" fillcolor="#A0A0A0" stroked="f"/>
@@ -2345,38 +2446,61 @@
     <w:p>
       <w:pPr>
         <w:pStyle w:val="Heading2"/>
-        <w:rPr/>
-      </w:pPr>
-      <w:bookmarkStart w:colFirst="0" w:colLast="0" w:name="_2j6xcyz5wi8z" w:id="16"/>
+        <w:spacing w:after="160" w:lineRule="auto"/>
+        <w:rPr/>
+      </w:pPr>
+      <w:bookmarkStart w:colFirst="0" w:colLast="0" w:name="_cpryxhpkzygi" w:id="16"/>
       <w:bookmarkEnd w:id="16"/>
       <w:r>
         <w:rPr>
           <w:rtl w:val="0"/>
         </w:rPr>
-        <w:t xml:space="preserve">FR-3 Vulnerability and Dependency Scanning</w:t>
-      </w:r>
-    </w:p>
-    <w:p>
-      <w:pPr>
-        <w:rPr/>
-      </w:pPr>
-      <w:r>
-        <w:rPr>
-          <w:rtl w:val="0"/>
-        </w:rPr>
-        <w:t xml:space="preserve">The system shall scan dependencies and container artifacts for known vulnerabilities.</w:t>
-      </w:r>
-    </w:p>
-    <w:p>
-      <w:pPr>
-        <w:rPr/>
-      </w:pPr>
-      <w:r>
-        <w:rPr>
-          <w:rtl w:val="0"/>
-        </w:rPr>
-        <w:t xml:space="preserve"> </w:t>
-      </w:r>
+        <w:t xml:space="preserve">FR-3 SBOM Operational Requirements</w:t>
+      </w:r>
+    </w:p>
+    <w:p>
+      <w:pPr>
+        <w:numPr>
+          <w:ilvl w:val="0"/>
+          <w:numId w:val="18"/>
+        </w:numPr>
+        <w:spacing w:after="0" w:afterAutospacing="0" w:lineRule="auto"/>
+        <w:ind w:left="720" w:hanging="360"/>
+        <w:rPr>
+          <w:u w:val="none"/>
+        </w:rPr>
+      </w:pPr>
+      <w:r>
+        <w:rPr>
+          <w:rtl w:val="0"/>
+        </w:rPr>
+        <w:t xml:space="preserve">A new SBOM shall be generated for every build or dependency change.</w:t>
+      </w:r>
+    </w:p>
+    <w:p>
+      <w:pPr>
+        <w:numPr>
+          <w:ilvl w:val="0"/>
+          <w:numId w:val="18"/>
+        </w:numPr>
+        <w:spacing w:after="160" w:lineRule="auto"/>
+        <w:ind w:left="720" w:hanging="360"/>
+        <w:rPr>
+          <w:u w:val="none"/>
+        </w:rPr>
+      </w:pPr>
+      <w:r>
+        <w:rPr>
+          <w:rtl w:val="0"/>
+        </w:rPr>
+        <w:t xml:space="preserve">The SBOM shall be produced in a machine-readable format (CycloneDX or SPDX).</w:t>
+      </w:r>
+    </w:p>
+    <w:p>
+      <w:pPr>
+        <w:spacing w:after="160" w:lineRule="auto"/>
+        <w:rPr/>
+      </w:pPr>
       <w:r>
         <w:pict>
           <v:rect style="width:0.0pt;height:1.5pt" o:hr="t" o:hrstd="t" o:hralign="center" fillcolor="#A0A0A0" stroked="f"/>
@@ -2393,24 +2517,24 @@
         <w:pStyle w:val="Heading2"/>
         <w:rPr/>
       </w:pPr>
-      <w:bookmarkStart w:colFirst="0" w:colLast="0" w:name="_r0yu5f6vvx89" w:id="17"/>
+      <w:bookmarkStart w:colFirst="0" w:colLast="0" w:name="_eo4bysd7w4hw" w:id="17"/>
       <w:bookmarkEnd w:id="17"/>
       <w:r>
         <w:rPr>
           <w:rtl w:val="0"/>
         </w:rPr>
-        <w:t xml:space="preserve">FR-4 Unified Output Schema</w:t>
-      </w:r>
-    </w:p>
-    <w:p>
-      <w:pPr>
-        <w:rPr/>
-      </w:pPr>
-      <w:r>
-        <w:rPr>
-          <w:rtl w:val="0"/>
-        </w:rPr>
-        <w:t xml:space="preserve">The system shall normalize outputs from SBOM and scanning tools into a unified schema for ML ingestion.</w:t>
+        <w:t xml:space="preserve">FR-4 Static Application Security Testing (SAST)</w:t>
+      </w:r>
+    </w:p>
+    <w:p>
+      <w:pPr>
+        <w:rPr/>
+      </w:pPr>
+      <w:r>
+        <w:rPr>
+          <w:rtl w:val="0"/>
+        </w:rPr>
+        <w:t xml:space="preserve">The system shall run static security scanning (e.g., Bandit) on source code and produce structured findings.</w:t>
       </w:r>
     </w:p>
     <w:p>
@@ -2439,180 +2563,32 @@
         <w:pStyle w:val="Heading2"/>
         <w:rPr/>
       </w:pPr>
-      <w:bookmarkStart w:colFirst="0" w:colLast="0" w:name="_3s7ngvsmq495" w:id="18"/>
+      <w:bookmarkStart w:colFirst="0" w:colLast="0" w:name="_2j6xcyz5wi8z" w:id="18"/>
       <w:bookmarkEnd w:id="18"/>
       <w:r>
         <w:rPr>
           <w:rtl w:val="0"/>
         </w:rPr>
-        <w:t xml:space="preserve">FR-5 ML Risk Classification Gate</w:t>
-      </w:r>
-    </w:p>
-    <w:p>
-      <w:pPr>
-        <w:rPr/>
-      </w:pPr>
-      <w:r>
-        <w:rPr>
-          <w:rtl w:val="0"/>
-        </w:rPr>
-        <w:t xml:space="preserve">The system shall classify builds into one of the following outcomes:</w:t>
-        <w:br w:type="textWrapping"/>
-      </w:r>
-    </w:p>
-    <w:p>
-      <w:pPr>
-        <w:numPr>
-          <w:ilvl w:val="0"/>
-          <w:numId w:val="1"/>
-        </w:numPr>
-        <w:ind w:left="720" w:hanging="360"/>
-      </w:pPr>
-      <w:r>
-        <w:rPr>
-          <w:rtl w:val="0"/>
-        </w:rPr>
-        <w:t xml:space="preserve">ALLOW</w:t>
-      </w:r>
-    </w:p>
-    <w:p>
-      <w:pPr>
-        <w:numPr>
-          <w:ilvl w:val="0"/>
-          <w:numId w:val="1"/>
-        </w:numPr>
-        <w:ind w:left="720" w:hanging="360"/>
-      </w:pPr>
-      <w:r>
-        <w:rPr>
-          <w:rtl w:val="0"/>
-        </w:rPr>
-        <w:t xml:space="preserve">WARN</w:t>
-      </w:r>
-    </w:p>
-    <w:p>
-      <w:pPr>
-        <w:numPr>
-          <w:ilvl w:val="0"/>
-          <w:numId w:val="1"/>
-        </w:numPr>
-        <w:ind w:left="720" w:hanging="360"/>
-      </w:pPr>
-      <w:r>
-        <w:rPr>
-          <w:rtl w:val="0"/>
-        </w:rPr>
-        <w:t xml:space="preserve">BLOCK</w:t>
-        <w:br w:type="textWrapping"/>
-      </w:r>
-    </w:p>
-    <w:p>
-      <w:pPr>
-        <w:rPr/>
-      </w:pPr>
-      <w:r>
-        <w:rPr>
-          <w:rtl w:val="0"/>
-        </w:rPr>
-        <w:t xml:space="preserve">based on contextual risk signals.</w:t>
-        <w:br w:type="textWrapping"/>
-      </w:r>
-    </w:p>
-    <w:p>
-      <w:pPr>
-        <w:rPr/>
-      </w:pPr>
-      <w:r>
-        <w:rPr>
-          <w:rtl w:val="0"/>
-        </w:rPr>
-        <w:t xml:space="preserve">The ML classifier shall:</w:t>
-      </w:r>
-    </w:p>
-    <w:p>
-      <w:pPr>
-        <w:numPr>
-          <w:ilvl w:val="0"/>
-          <w:numId w:val="18"/>
-        </w:numPr>
-        <w:ind w:left="720" w:hanging="360"/>
-        <w:rPr>
-          <w:u w:val="none"/>
-        </w:rPr>
-      </w:pPr>
-      <w:r>
-        <w:rPr>
-          <w:rtl w:val="0"/>
-        </w:rPr>
-        <w:t xml:space="preserve">Output a classification label (ALLOW/WARN/BLOCK).</w:t>
-      </w:r>
-    </w:p>
-    <w:p>
-      <w:pPr>
-        <w:numPr>
-          <w:ilvl w:val="0"/>
-          <w:numId w:val="18"/>
-        </w:numPr>
-        <w:ind w:left="720" w:hanging="360"/>
-        <w:rPr>
-          <w:u w:val="none"/>
-        </w:rPr>
-      </w:pPr>
-      <w:r>
-        <w:rPr>
-          <w:rtl w:val="0"/>
-        </w:rPr>
-        <w:t xml:space="preserve">Output a confidence or probability score.</w:t>
-      </w:r>
-    </w:p>
-    <w:p>
-      <w:pPr>
-        <w:numPr>
-          <w:ilvl w:val="0"/>
-          <w:numId w:val="18"/>
-        </w:numPr>
-        <w:ind w:left="720" w:hanging="360"/>
-        <w:rPr>
-          <w:u w:val="none"/>
-        </w:rPr>
-      </w:pPr>
-      <w:r>
-        <w:rPr>
-          <w:rtl w:val="0"/>
-        </w:rPr>
-        <w:t xml:space="preserve">Log the input feature vector used for classification.</w:t>
-      </w:r>
-    </w:p>
-    <w:p>
-      <w:pPr>
-        <w:numPr>
-          <w:ilvl w:val="0"/>
-          <w:numId w:val="18"/>
-        </w:numPr>
-        <w:ind w:left="720" w:hanging="360"/>
-        <w:rPr>
-          <w:u w:val="none"/>
-        </w:rPr>
-      </w:pPr>
-      <w:r>
-        <w:rPr>
-          <w:rtl w:val="0"/>
-        </w:rPr>
-        <w:t xml:space="preserve">Support traceability of feature contributions used in classification for audit review.</w:t>
-      </w:r>
-    </w:p>
-    <w:p>
-      <w:pPr>
-        <w:spacing w:after="160" w:lineRule="auto"/>
-        <w:rPr>
-          <w:sz w:val="18"/>
-          <w:szCs w:val="18"/>
-        </w:rPr>
-      </w:pPr>
-      <w:r>
-        <w:rPr>
-          <w:sz w:val="18"/>
-          <w:szCs w:val="18"/>
+        <w:t xml:space="preserve">FR-5 Vulnerability and Dependency Scanning</w:t>
+      </w:r>
+    </w:p>
+    <w:p>
+      <w:pPr>
+        <w:rPr/>
+      </w:pPr>
+      <w:r>
+        <w:rPr>
+          <w:rtl w:val="0"/>
+        </w:rPr>
+        <w:t xml:space="preserve">The system shall scan dependencies and container artifacts for known vulnerabilities.</w:t>
+      </w:r>
+    </w:p>
+    <w:p>
+      <w:pPr>
+        <w:rPr/>
+      </w:pPr>
+      <w:r>
+        <w:rPr>
           <w:rtl w:val="0"/>
         </w:rPr>
         <w:t xml:space="preserve"> </w:t>
@@ -2633,155 +2609,24 @@
         <w:pStyle w:val="Heading2"/>
         <w:rPr/>
       </w:pPr>
-      <w:bookmarkStart w:colFirst="0" w:colLast="0" w:name="_w8nqc8inec9d" w:id="19"/>
+      <w:bookmarkStart w:colFirst="0" w:colLast="0" w:name="_r0yu5f6vvx89" w:id="19"/>
       <w:bookmarkEnd w:id="19"/>
       <w:r>
         <w:rPr>
           <w:rtl w:val="0"/>
         </w:rPr>
-        <w:t xml:space="preserve">FR-6 Deployment Enforcement</w:t>
-      </w:r>
-    </w:p>
-    <w:p>
-      <w:pPr>
-        <w:rPr/>
-      </w:pPr>
-      <w:r>
-        <w:rPr>
-          <w:rtl w:val="0"/>
-        </w:rPr>
-        <w:t xml:space="preserve">The system shall enforce deployment decisions based on ML classification outcomes.</w:t>
-      </w:r>
-    </w:p>
-    <w:p>
-      <w:pPr>
-        <w:numPr>
-          <w:ilvl w:val="0"/>
-          <w:numId w:val="10"/>
-        </w:numPr>
-        <w:ind w:left="720" w:hanging="360"/>
-      </w:pPr>
-      <w:r>
-        <w:rPr>
-          <w:rtl w:val="0"/>
-        </w:rPr>
-        <w:t xml:space="preserve">If classification = BLOCK:</w:t>
-      </w:r>
-    </w:p>
-    <w:p>
-      <w:pPr>
-        <w:numPr>
-          <w:ilvl w:val="1"/>
-          <w:numId w:val="10"/>
-        </w:numPr>
-        <w:ind w:left="1440" w:hanging="360"/>
-      </w:pPr>
-      <w:r>
-        <w:rPr>
-          <w:rtl w:val="0"/>
-        </w:rPr>
-        <w:t xml:space="preserve">The system shall prevent artifact promotion to protected branches or production environments.</w:t>
-      </w:r>
-    </w:p>
-    <w:p>
-      <w:pPr>
-        <w:numPr>
-          <w:ilvl w:val="1"/>
-          <w:numId w:val="10"/>
-        </w:numPr>
-        <w:ind w:left="1440" w:hanging="360"/>
-      </w:pPr>
-      <w:r>
-        <w:rPr>
-          <w:rtl w:val="0"/>
-        </w:rPr>
-        <w:t xml:space="preserve">The build shall fail or be marked as non-deployable.</w:t>
-      </w:r>
-    </w:p>
-    <w:p>
-      <w:pPr>
-        <w:numPr>
-          <w:ilvl w:val="0"/>
-          <w:numId w:val="10"/>
-        </w:numPr>
-        <w:ind w:left="720" w:hanging="360"/>
-      </w:pPr>
-      <w:r>
-        <w:rPr>
-          <w:rtl w:val="0"/>
-        </w:rPr>
-        <w:t xml:space="preserve">If classification = WARN:</w:t>
-      </w:r>
-    </w:p>
-    <w:p>
-      <w:pPr>
-        <w:numPr>
-          <w:ilvl w:val="1"/>
-          <w:numId w:val="10"/>
-        </w:numPr>
-        <w:ind w:left="1440" w:hanging="360"/>
-      </w:pPr>
-      <w:r>
-        <w:rPr>
-          <w:rtl w:val="0"/>
-        </w:rPr>
-        <w:t xml:space="preserve">The system shall allow promotion only to a staging environment.</w:t>
-      </w:r>
-    </w:p>
-    <w:p>
-      <w:pPr>
-        <w:numPr>
-          <w:ilvl w:val="1"/>
-          <w:numId w:val="10"/>
-        </w:numPr>
-        <w:ind w:left="1440" w:hanging="360"/>
-      </w:pPr>
-      <w:r>
-        <w:rPr>
-          <w:rtl w:val="0"/>
-        </w:rPr>
-        <w:t xml:space="preserve">Manual review shall be required before production deployment.</w:t>
-      </w:r>
-    </w:p>
-    <w:p>
-      <w:pPr>
-        <w:numPr>
-          <w:ilvl w:val="0"/>
-          <w:numId w:val="10"/>
-        </w:numPr>
-        <w:ind w:left="720" w:hanging="360"/>
-      </w:pPr>
-      <w:r>
-        <w:rPr>
-          <w:rtl w:val="0"/>
-        </w:rPr>
-        <w:t xml:space="preserve">If classification = ALLOW:</w:t>
-      </w:r>
-    </w:p>
-    <w:p>
-      <w:pPr>
-        <w:numPr>
-          <w:ilvl w:val="1"/>
-          <w:numId w:val="10"/>
-        </w:numPr>
-        <w:ind w:left="1440" w:hanging="360"/>
-      </w:pPr>
-      <w:r>
-        <w:rPr>
-          <w:rtl w:val="0"/>
-        </w:rPr>
-        <w:t xml:space="preserve">The system shall permit artifact promotion to production environments.</w:t>
-      </w:r>
-    </w:p>
-    <w:p>
-      <w:pPr>
-        <w:rPr/>
-      </w:pPr>
-      <w:r>
-        <w:rPr>
-          <w:rtl w:val="0"/>
-        </w:rPr>
-        <w:t xml:space="preserve">All enforcement outcomes shall be logged in the audit record.</w:t>
+        <w:t xml:space="preserve">FR-6 Unified Output Schema</w:t>
+      </w:r>
+    </w:p>
+    <w:p>
+      <w:pPr>
+        <w:rPr/>
+      </w:pPr>
+      <w:r>
+        <w:rPr>
+          <w:rtl w:val="0"/>
+        </w:rPr>
+        <w:t xml:space="preserve">The system shall normalize outputs from SBOM and scanning tools into a unified schema for ML ingestion.</w:t>
       </w:r>
     </w:p>
     <w:p>
@@ -2810,24 +2655,24 @@
         <w:pStyle w:val="Heading2"/>
         <w:rPr/>
       </w:pPr>
-      <w:bookmarkStart w:colFirst="0" w:colLast="0" w:name="_lm2re6l1fk4r" w:id="20"/>
+      <w:bookmarkStart w:colFirst="0" w:colLast="0" w:name="_3s7ngvsmq495" w:id="20"/>
       <w:bookmarkEnd w:id="20"/>
       <w:r>
         <w:rPr>
           <w:rtl w:val="0"/>
         </w:rPr>
-        <w:t xml:space="preserve">FR-7 Compliance Logging</w:t>
-      </w:r>
-    </w:p>
-    <w:p>
-      <w:pPr>
-        <w:rPr/>
-      </w:pPr>
-      <w:r>
-        <w:rPr>
-          <w:rtl w:val="0"/>
-        </w:rPr>
-        <w:t xml:space="preserve">The system shall retain, per build execution:</w:t>
+        <w:t xml:space="preserve">FR-7 ML Risk Classification Gate</w:t>
+      </w:r>
+    </w:p>
+    <w:p>
+      <w:pPr>
+        <w:rPr/>
+      </w:pPr>
+      <w:r>
+        <w:rPr>
+          <w:rtl w:val="0"/>
+        </w:rPr>
+        <w:t xml:space="preserve">The system shall classify builds into one of the following outcomes:</w:t>
         <w:br w:type="textWrapping"/>
       </w:r>
     </w:p>
@@ -2835,135 +2680,141 @@
       <w:pPr>
         <w:numPr>
           <w:ilvl w:val="0"/>
-          <w:numId w:val="13"/>
-        </w:numPr>
-        <w:ind w:left="720" w:hanging="360"/>
-      </w:pPr>
-      <w:r>
-        <w:rPr>
-          <w:rtl w:val="0"/>
-        </w:rPr>
-        <w:t xml:space="preserve">Scan outputs</w:t>
-      </w:r>
-    </w:p>
-    <w:p>
-      <w:pPr>
-        <w:numPr>
-          <w:ilvl w:val="0"/>
-          <w:numId w:val="13"/>
-        </w:numPr>
-        <w:ind w:left="720" w:hanging="360"/>
-      </w:pPr>
-      <w:r>
-        <w:rPr>
-          <w:rtl w:val="0"/>
-        </w:rPr>
-        <w:t xml:space="preserve">SBOM artifacts</w:t>
-      </w:r>
-    </w:p>
-    <w:p>
-      <w:pPr>
-        <w:numPr>
-          <w:ilvl w:val="0"/>
-          <w:numId w:val="13"/>
-        </w:numPr>
-        <w:ind w:left="720" w:hanging="360"/>
-      </w:pPr>
-      <w:r>
-        <w:rPr>
-          <w:rtl w:val="0"/>
-        </w:rPr>
-        <w:t xml:space="preserve">ML classification decisions</w:t>
-      </w:r>
-    </w:p>
-    <w:p>
-      <w:pPr>
-        <w:numPr>
-          <w:ilvl w:val="0"/>
-          <w:numId w:val="13"/>
-        </w:numPr>
-        <w:ind w:left="720" w:hanging="360"/>
-      </w:pPr>
-      <w:r>
-        <w:rPr>
-          <w:rtl w:val="0"/>
-        </w:rPr>
-        <w:t xml:space="preserve">Enforcement actions</w:t>
-      </w:r>
-    </w:p>
-    <w:p>
-      <w:pPr>
-        <w:numPr>
-          <w:ilvl w:val="0"/>
-          <w:numId w:val="13"/>
-        </w:numPr>
-        <w:ind w:left="720" w:hanging="360"/>
-      </w:pPr>
-      <w:r>
-        <w:rPr>
-          <w:rtl w:val="0"/>
-        </w:rPr>
-        <w:t xml:space="preserve">Extracted feature vector</w:t>
-      </w:r>
-    </w:p>
-    <w:p>
-      <w:pPr>
-        <w:numPr>
-          <w:ilvl w:val="0"/>
-          <w:numId w:val="13"/>
-        </w:numPr>
-        <w:ind w:left="720" w:hanging="360"/>
-      </w:pPr>
-      <w:r>
-        <w:rPr>
-          <w:rtl w:val="0"/>
-        </w:rPr>
-        <w:t xml:space="preserve">ML confidence score</w:t>
-      </w:r>
-    </w:p>
-    <w:p>
-      <w:pPr>
-        <w:numPr>
-          <w:ilvl w:val="0"/>
-          <w:numId w:val="13"/>
-        </w:numPr>
-        <w:ind w:left="720" w:hanging="360"/>
-      </w:pPr>
-      <w:r>
-        <w:rPr>
-          <w:rtl w:val="0"/>
-        </w:rPr>
-        <w:t xml:space="preserve">Manual override records (if applicable)</w:t>
-      </w:r>
-    </w:p>
-    <w:p>
-      <w:pPr>
-        <w:numPr>
-          <w:ilvl w:val="0"/>
-          <w:numId w:val="13"/>
-        </w:numPr>
-        <w:ind w:left="720" w:hanging="360"/>
-      </w:pPr>
-      <w:r>
-        <w:rPr>
-          <w:rtl w:val="0"/>
-        </w:rPr>
-        <w:t xml:space="preserve">User identity associated with override</w:t>
-      </w:r>
-    </w:p>
-    <w:p>
-      <w:pPr>
-        <w:numPr>
-          <w:ilvl w:val="0"/>
-          <w:numId w:val="13"/>
-        </w:numPr>
-        <w:ind w:left="720" w:hanging="360"/>
-      </w:pPr>
-      <w:r>
-        <w:rPr>
-          <w:rtl w:val="0"/>
-        </w:rPr>
-        <w:t xml:space="preserve">Timestamped enforcement decision to support compliance evidence and audit review.</w:t>
+          <w:numId w:val="1"/>
+        </w:numPr>
+        <w:ind w:left="720" w:hanging="360"/>
+      </w:pPr>
+      <w:r>
+        <w:rPr>
+          <w:rtl w:val="0"/>
+        </w:rPr>
+        <w:t xml:space="preserve">ALLOW</w:t>
+      </w:r>
+    </w:p>
+    <w:p>
+      <w:pPr>
+        <w:numPr>
+          <w:ilvl w:val="0"/>
+          <w:numId w:val="1"/>
+        </w:numPr>
+        <w:ind w:left="720" w:hanging="360"/>
+      </w:pPr>
+      <w:r>
+        <w:rPr>
+          <w:rtl w:val="0"/>
+        </w:rPr>
+        <w:t xml:space="preserve">WARN</w:t>
+      </w:r>
+    </w:p>
+    <w:p>
+      <w:pPr>
+        <w:numPr>
+          <w:ilvl w:val="0"/>
+          <w:numId w:val="1"/>
+        </w:numPr>
+        <w:ind w:left="720" w:hanging="360"/>
+      </w:pPr>
+      <w:r>
+        <w:rPr>
+          <w:rtl w:val="0"/>
+        </w:rPr>
+        <w:t xml:space="preserve">BLOCK</w:t>
+        <w:br w:type="textWrapping"/>
+      </w:r>
+    </w:p>
+    <w:p>
+      <w:pPr>
+        <w:rPr/>
+      </w:pPr>
+      <w:r>
+        <w:rPr>
+          <w:rtl w:val="0"/>
+        </w:rPr>
+        <w:t xml:space="preserve">based on contextual risk signals.</w:t>
+        <w:br w:type="textWrapping"/>
+      </w:r>
+    </w:p>
+    <w:p>
+      <w:pPr>
+        <w:rPr/>
+      </w:pPr>
+      <w:r>
+        <w:rPr>
+          <w:rtl w:val="0"/>
+        </w:rPr>
+        <w:t xml:space="preserve">The ML classifier shall:</w:t>
+      </w:r>
+    </w:p>
+    <w:p>
+      <w:pPr>
+        <w:numPr>
+          <w:ilvl w:val="0"/>
+          <w:numId w:val="17"/>
+        </w:numPr>
+        <w:ind w:left="720" w:hanging="360"/>
+        <w:rPr>
+          <w:u w:val="none"/>
+        </w:rPr>
+      </w:pPr>
+      <w:r>
+        <w:rPr>
+          <w:rtl w:val="0"/>
+        </w:rPr>
+        <w:t xml:space="preserve">Output a classification label (ALLOW/WARN/BLOCK).</w:t>
+      </w:r>
+    </w:p>
+    <w:p>
+      <w:pPr>
+        <w:numPr>
+          <w:ilvl w:val="0"/>
+          <w:numId w:val="17"/>
+        </w:numPr>
+        <w:ind w:left="720" w:hanging="360"/>
+        <w:rPr>
+          <w:u w:val="none"/>
+        </w:rPr>
+      </w:pPr>
+      <w:r>
+        <w:rPr>
+          <w:rtl w:val="0"/>
+        </w:rPr>
+        <w:t xml:space="preserve">Output a confidence or probability score.</w:t>
+      </w:r>
+    </w:p>
+    <w:p>
+      <w:pPr>
+        <w:numPr>
+          <w:ilvl w:val="0"/>
+          <w:numId w:val="17"/>
+        </w:numPr>
+        <w:ind w:left="720" w:hanging="360"/>
+        <w:rPr>
+          <w:u w:val="none"/>
+        </w:rPr>
+      </w:pPr>
+      <w:r>
+        <w:rPr>
+          <w:rtl w:val="0"/>
+        </w:rPr>
+        <w:t xml:space="preserve">Log the input feature vector used for classification.</w:t>
+      </w:r>
+    </w:p>
+    <w:p>
+      <w:pPr>
+        <w:numPr>
+          <w:ilvl w:val="0"/>
+          <w:numId w:val="17"/>
+        </w:numPr>
+        <w:ind w:left="720" w:hanging="360"/>
+        <w:rPr>
+          <w:u w:val="none"/>
+        </w:rPr>
+      </w:pPr>
+      <w:r>
+        <w:rPr>
+          <w:rtl w:val="0"/>
+        </w:rPr>
+        <w:t xml:space="preserve">Support traceability of feature contributions used in classification for audit review.</w:t>
       </w:r>
     </w:p>
     <w:p>
@@ -2998,38 +2849,163 @@
         <w:pStyle w:val="Heading2"/>
         <w:rPr/>
       </w:pPr>
-      <w:bookmarkStart w:colFirst="0" w:colLast="0" w:name="_8iidmr4hzrpq" w:id="21"/>
+      <w:bookmarkStart w:colFirst="0" w:colLast="0" w:name="_w8nqc8inec9d" w:id="21"/>
       <w:bookmarkEnd w:id="21"/>
       <w:r>
         <w:rPr>
           <w:rtl w:val="0"/>
         </w:rPr>
-        <w:t xml:space="preserve">FR-8 Feature Extraction and Normalization</w:t>
-      </w:r>
-    </w:p>
-    <w:p>
-      <w:pPr>
-        <w:rPr/>
-      </w:pPr>
-      <w:r>
-        <w:rPr>
-          <w:rtl w:val="0"/>
-        </w:rPr>
-        <w:t xml:space="preserve">The system shall extract security-relevant statistics from SBOM, vulnerability, and SAST outputs and normalize them into a fixed feature vector schema for ML classification.</w:t>
-      </w:r>
-    </w:p>
-    <w:p>
-      <w:pPr>
-        <w:spacing w:after="360" w:lineRule="auto"/>
-        <w:rPr>
-          <w:sz w:val="18"/>
-          <w:szCs w:val="18"/>
-        </w:rPr>
-      </w:pPr>
-      <w:r>
-        <w:rPr>
-          <w:sz w:val="18"/>
-          <w:szCs w:val="18"/>
+        <w:t xml:space="preserve">FR-8 Deployment Enforcement</w:t>
+      </w:r>
+    </w:p>
+    <w:p>
+      <w:pPr>
+        <w:rPr/>
+      </w:pPr>
+      <w:r>
+        <w:rPr>
+          <w:rtl w:val="0"/>
+        </w:rPr>
+        <w:t xml:space="preserve">The system shall enforce deployment decisions based on ML classification outcomes.</w:t>
+      </w:r>
+    </w:p>
+    <w:p>
+      <w:pPr>
+        <w:numPr>
+          <w:ilvl w:val="0"/>
+          <w:numId w:val="9"/>
+        </w:numPr>
+        <w:ind w:left="720" w:hanging="360"/>
+      </w:pPr>
+      <w:r>
+        <w:rPr>
+          <w:rtl w:val="0"/>
+        </w:rPr>
+        <w:t xml:space="preserve">If classification = BLOCK:</w:t>
+      </w:r>
+    </w:p>
+    <w:p>
+      <w:pPr>
+        <w:numPr>
+          <w:ilvl w:val="1"/>
+          <w:numId w:val="9"/>
+        </w:numPr>
+        <w:ind w:left="1440" w:hanging="360"/>
+      </w:pPr>
+      <w:r>
+        <w:rPr>
+          <w:rtl w:val="0"/>
+        </w:rPr>
+        <w:t xml:space="preserve">The system shall prevent artifact promotion to protected branches or production environments.</w:t>
+      </w:r>
+    </w:p>
+    <w:p>
+      <w:pPr>
+        <w:numPr>
+          <w:ilvl w:val="1"/>
+          <w:numId w:val="9"/>
+        </w:numPr>
+        <w:ind w:left="1440" w:hanging="360"/>
+      </w:pPr>
+      <w:r>
+        <w:rPr>
+          <w:rtl w:val="0"/>
+        </w:rPr>
+        <w:t xml:space="preserve">The build shall fail or be marked as non-deployable.</w:t>
+      </w:r>
+    </w:p>
+    <w:p>
+      <w:pPr>
+        <w:numPr>
+          <w:ilvl w:val="0"/>
+          <w:numId w:val="9"/>
+        </w:numPr>
+        <w:ind w:left="720" w:hanging="360"/>
+      </w:pPr>
+      <w:r>
+        <w:rPr>
+          <w:rtl w:val="0"/>
+        </w:rPr>
+        <w:t xml:space="preserve">If classification = WARN:</w:t>
+      </w:r>
+    </w:p>
+    <w:p>
+      <w:pPr>
+        <w:numPr>
+          <w:ilvl w:val="1"/>
+          <w:numId w:val="9"/>
+        </w:numPr>
+        <w:ind w:left="1440" w:hanging="360"/>
+      </w:pPr>
+      <w:r>
+        <w:rPr>
+          <w:rtl w:val="0"/>
+        </w:rPr>
+        <w:t xml:space="preserve">The system shall allow promotion only to a staging environment.</w:t>
+      </w:r>
+    </w:p>
+    <w:p>
+      <w:pPr>
+        <w:numPr>
+          <w:ilvl w:val="1"/>
+          <w:numId w:val="9"/>
+        </w:numPr>
+        <w:ind w:left="1440" w:hanging="360"/>
+      </w:pPr>
+      <w:r>
+        <w:rPr>
+          <w:rtl w:val="0"/>
+        </w:rPr>
+        <w:t xml:space="preserve">Manual review shall be required before production deployment.</w:t>
+      </w:r>
+    </w:p>
+    <w:p>
+      <w:pPr>
+        <w:numPr>
+          <w:ilvl w:val="0"/>
+          <w:numId w:val="9"/>
+        </w:numPr>
+        <w:ind w:left="720" w:hanging="360"/>
+      </w:pPr>
+      <w:r>
+        <w:rPr>
+          <w:rtl w:val="0"/>
+        </w:rPr>
+        <w:t xml:space="preserve">If classification = ALLOW:</w:t>
+      </w:r>
+    </w:p>
+    <w:p>
+      <w:pPr>
+        <w:numPr>
+          <w:ilvl w:val="1"/>
+          <w:numId w:val="9"/>
+        </w:numPr>
+        <w:ind w:left="1440" w:hanging="360"/>
+      </w:pPr>
+      <w:r>
+        <w:rPr>
+          <w:rtl w:val="0"/>
+        </w:rPr>
+        <w:t xml:space="preserve">The system shall permit artifact promotion to production environments.</w:t>
+      </w:r>
+    </w:p>
+    <w:p>
+      <w:pPr>
+        <w:rPr/>
+      </w:pPr>
+      <w:r>
+        <w:rPr>
+          <w:rtl w:val="0"/>
+        </w:rPr>
+        <w:t xml:space="preserve">All enforcement outcomes shall be logged in the audit record.</w:t>
+      </w:r>
+    </w:p>
+    <w:p>
+      <w:pPr>
+        <w:rPr/>
+      </w:pPr>
+      <w:r>
+        <w:rPr>
           <w:rtl w:val="0"/>
         </w:rPr>
         <w:t xml:space="preserve"> </w:t>
@@ -3047,117 +3023,16 @@
     </w:p>
     <w:p>
       <w:pPr>
-        <w:pStyle w:val="Heading1"/>
-        <w:rPr/>
-      </w:pPr>
-      <w:bookmarkStart w:colFirst="0" w:colLast="0" w:name="_62xuv5yi4q7d" w:id="22"/>
+        <w:pStyle w:val="Heading2"/>
+        <w:rPr/>
+      </w:pPr>
+      <w:bookmarkStart w:colFirst="0" w:colLast="0" w:name="_kaqhz5l88m6t" w:id="22"/>
       <w:bookmarkEnd w:id="22"/>
       <w:r>
         <w:rPr>
           <w:rtl w:val="0"/>
         </w:rPr>
-        <w:t xml:space="preserve">4. ML Governance and Override Requirements</w:t>
-      </w:r>
-    </w:p>
-    <w:p>
-      <w:pPr>
-        <w:pStyle w:val="Heading2"/>
-        <w:rPr/>
-      </w:pPr>
-      <w:bookmarkStart w:colFirst="0" w:colLast="0" w:name="_wd3kgcok4afp" w:id="23"/>
-      <w:bookmarkEnd w:id="23"/>
-      <w:r>
-        <w:rPr>
-          <w:rtl w:val="0"/>
-        </w:rPr>
-        <w:t xml:space="preserve">4.1 Model Governance</w:t>
-      </w:r>
-    </w:p>
-    <w:p>
-      <w:pPr>
-        <w:rPr/>
-      </w:pPr>
-      <w:r>
-        <w:rPr>
-          <w:rtl w:val="0"/>
-        </w:rPr>
-        <w:t xml:space="preserve">The ML classifier shall:</w:t>
-        <w:br w:type="textWrapping"/>
-      </w:r>
-    </w:p>
-    <w:p>
-      <w:pPr>
-        <w:numPr>
-          <w:ilvl w:val="0"/>
-          <w:numId w:val="20"/>
-        </w:numPr>
-        <w:ind w:left="720" w:hanging="360"/>
-      </w:pPr>
-      <w:r>
-        <w:rPr>
-          <w:rtl w:val="0"/>
-        </w:rPr>
-        <w:t xml:space="preserve">Be version-controlled.</w:t>
-      </w:r>
-    </w:p>
-    <w:p>
-      <w:pPr>
-        <w:numPr>
-          <w:ilvl w:val="0"/>
-          <w:numId w:val="20"/>
-        </w:numPr>
-        <w:ind w:left="720" w:hanging="360"/>
-      </w:pPr>
-      <w:r>
-        <w:rPr>
-          <w:rtl w:val="0"/>
-        </w:rPr>
-        <w:t xml:space="preserve">Operate in inference-only mode within CI/CD.</w:t>
-      </w:r>
-    </w:p>
-    <w:p>
-      <w:pPr>
-        <w:numPr>
-          <w:ilvl w:val="0"/>
-          <w:numId w:val="20"/>
-        </w:numPr>
-        <w:ind w:left="720" w:hanging="360"/>
-      </w:pPr>
-      <w:r>
-        <w:rPr>
-          <w:rtl w:val="0"/>
-        </w:rPr>
-        <w:t xml:space="preserve">Log model version used per build.</w:t>
-      </w:r>
-    </w:p>
-    <w:p>
-      <w:pPr>
-        <w:numPr>
-          <w:ilvl w:val="0"/>
-          <w:numId w:val="20"/>
-        </w:numPr>
-        <w:ind w:left="720" w:hanging="360"/>
-      </w:pPr>
-      <w:r>
-        <w:rPr>
-          <w:rtl w:val="0"/>
-        </w:rPr>
-        <w:t xml:space="preserve">Support offline retraining using labeled datasets.</w:t>
-        <w:br w:type="textWrapping"/>
-      </w:r>
-    </w:p>
-    <w:p>
-      <w:pPr>
-        <w:pStyle w:val="Heading2"/>
-        <w:rPr/>
-      </w:pPr>
-      <w:bookmarkStart w:colFirst="0" w:colLast="0" w:name="_v2022fvadwyt" w:id="24"/>
-      <w:bookmarkEnd w:id="24"/>
-      <w:r>
-        <w:rPr>
-          <w:rtl w:val="0"/>
-        </w:rPr>
-        <w:t xml:space="preserve">4.2 Manual Override Policy</w:t>
+        <w:t xml:space="preserve">FR-9 Manual Override Capability</w:t>
       </w:r>
     </w:p>
     <w:p>
@@ -3169,6 +3044,16 @@
           <w:rtl w:val="0"/>
         </w:rPr>
         <w:t xml:space="preserve">The system shall support manual override for WARN and BLOCK outcomes.</w:t>
+      </w:r>
+    </w:p>
+    <w:p>
+      <w:pPr>
+        <w:rPr/>
+      </w:pPr>
+      <w:r>
+        <w:rPr>
+          <w:rtl w:val="0"/>
+        </w:rPr>
       </w:r>
     </w:p>
     <w:p>
@@ -3187,9 +3072,12 @@
       <w:pPr>
         <w:numPr>
           <w:ilvl w:val="0"/>
-          <w:numId w:val="3"/>
-        </w:numPr>
-        <w:ind w:left="720" w:hanging="360"/>
+          <w:numId w:val="8"/>
+        </w:numPr>
+        <w:ind w:left="720" w:hanging="360"/>
+        <w:rPr>
+          <w:u w:val="none"/>
+        </w:rPr>
       </w:pPr>
       <w:r>
         <w:rPr>
@@ -3202,9 +3090,12 @@
       <w:pPr>
         <w:numPr>
           <w:ilvl w:val="0"/>
-          <w:numId w:val="3"/>
-        </w:numPr>
-        <w:ind w:left="720" w:hanging="360"/>
+          <w:numId w:val="8"/>
+        </w:numPr>
+        <w:ind w:left="720" w:hanging="360"/>
+        <w:rPr>
+          <w:u w:val="none"/>
+        </w:rPr>
       </w:pPr>
       <w:r>
         <w:rPr>
@@ -3217,9 +3108,12 @@
       <w:pPr>
         <w:numPr>
           <w:ilvl w:val="0"/>
-          <w:numId w:val="3"/>
-        </w:numPr>
-        <w:ind w:left="720" w:hanging="360"/>
+          <w:numId w:val="8"/>
+        </w:numPr>
+        <w:ind w:left="720" w:hanging="360"/>
+        <w:rPr>
+          <w:u w:val="none"/>
+        </w:rPr>
       </w:pPr>
       <w:r>
         <w:rPr>
@@ -3232,203 +3126,22 @@
       <w:pPr>
         <w:numPr>
           <w:ilvl w:val="0"/>
-          <w:numId w:val="3"/>
-        </w:numPr>
-        <w:ind w:left="720" w:hanging="360"/>
-      </w:pPr>
-      <w:r>
-        <w:rPr>
-          <w:rtl w:val="0"/>
-        </w:rPr>
-        <w:t xml:space="preserve">Be incorporated into future retraining dataset evaluation.</w:t>
-      </w:r>
-    </w:p>
-    <w:p>
-      <w:pPr>
-        <w:numPr>
-          <w:ilvl w:val="0"/>
-          <w:numId w:val="3"/>
-        </w:numPr>
-        <w:ind w:left="720" w:hanging="360"/>
-      </w:pPr>
-      <w:r>
-        <w:rPr>
-          <w:rtl w:val="0"/>
-        </w:rPr>
-        <w:t xml:space="preserve">Override capability shall be restricted to authorized reviewers.</w:t>
-        <w:br w:type="textWrapping"/>
-      </w:r>
-    </w:p>
-    <w:p>
-      <w:pPr>
-        <w:pStyle w:val="Heading2"/>
-        <w:rPr/>
-      </w:pPr>
-      <w:bookmarkStart w:colFirst="0" w:colLast="0" w:name="_upr8q7ilvtgq" w:id="25"/>
-      <w:bookmarkEnd w:id="25"/>
-      <w:r>
-        <w:rPr>
-          <w:rtl w:val="0"/>
-        </w:rPr>
-        <w:t xml:space="preserve">4.3 Explainability Requirement</w:t>
-      </w:r>
-    </w:p>
-    <w:p>
-      <w:pPr>
-        <w:rPr/>
-      </w:pPr>
-      <w:r>
-        <w:rPr>
-          <w:rtl w:val="0"/>
-        </w:rPr>
-        <w:t xml:space="preserve">The system shall retain sufficient feature-level data to allow post-deployment audit of:</w:t>
-        <w:br w:type="textWrapping"/>
-      </w:r>
-    </w:p>
-    <w:p>
-      <w:pPr>
-        <w:numPr>
-          <w:ilvl w:val="0"/>
-          <w:numId w:val="11"/>
-        </w:numPr>
-        <w:ind w:left="720" w:hanging="360"/>
-      </w:pPr>
-      <w:r>
-        <w:rPr>
-          <w:rtl w:val="0"/>
-        </w:rPr>
-        <w:t xml:space="preserve">Why a decision was made.</w:t>
-      </w:r>
-    </w:p>
-    <w:p>
-      <w:pPr>
-        <w:numPr>
-          <w:ilvl w:val="0"/>
-          <w:numId w:val="11"/>
-        </w:numPr>
-        <w:ind w:left="720" w:hanging="360"/>
-      </w:pPr>
-      <w:r>
-        <w:rPr>
-          <w:rtl w:val="0"/>
-        </w:rPr>
-        <w:t xml:space="preserve">Which features contributed to classification.</w:t>
-        <w:br w:type="textWrapping"/>
-      </w:r>
-    </w:p>
-    <w:p>
-      <w:pPr>
-        <w:pStyle w:val="Heading2"/>
-        <w:rPr/>
-      </w:pPr>
-      <w:bookmarkStart w:colFirst="0" w:colLast="0" w:name="_plt0jw4k8pvn" w:id="26"/>
-      <w:bookmarkEnd w:id="26"/>
-      <w:r>
-        <w:rPr>
-          <w:rtl w:val="0"/>
-        </w:rPr>
-        <w:t xml:space="preserve">4.4 Severity Assessment Rationale</w:t>
-      </w:r>
-    </w:p>
-    <w:p>
-      <w:pPr>
-        <w:rPr/>
-      </w:pPr>
-      <w:r>
-        <w:rPr>
-          <w:rtl w:val="0"/>
-        </w:rPr>
-        <w:t xml:space="preserve">Risk classification is influenced by measurable security indicators including:</w:t>
-        <w:br w:type="textWrapping"/>
-      </w:r>
-    </w:p>
-    <w:p>
-      <w:pPr>
-        <w:numPr>
-          <w:ilvl w:val="0"/>
-          <w:numId w:val="2"/>
-        </w:numPr>
-        <w:ind w:left="720" w:hanging="360"/>
-      </w:pPr>
-      <w:r>
-        <w:rPr>
-          <w:rtl w:val="0"/>
-        </w:rPr>
-        <w:t xml:space="preserve">Critical vulnerability counts</w:t>
-      </w:r>
-    </w:p>
-    <w:p>
-      <w:pPr>
-        <w:numPr>
-          <w:ilvl w:val="0"/>
-          <w:numId w:val="2"/>
-        </w:numPr>
-        <w:ind w:left="720" w:hanging="360"/>
-      </w:pPr>
-      <w:r>
-        <w:rPr>
-          <w:rtl w:val="0"/>
-        </w:rPr>
-        <w:t xml:space="preserve">Maximum CVSS score</w:t>
-      </w:r>
-    </w:p>
-    <w:p>
-      <w:pPr>
-        <w:numPr>
-          <w:ilvl w:val="0"/>
-          <w:numId w:val="2"/>
-        </w:numPr>
-        <w:ind w:left="720" w:hanging="360"/>
-      </w:pPr>
-      <w:r>
-        <w:rPr>
-          <w:rtl w:val="0"/>
-        </w:rPr>
-        <w:t xml:space="preserve">Presence of fix-available vulnerabilities</w:t>
-      </w:r>
-    </w:p>
-    <w:p>
-      <w:pPr>
-        <w:numPr>
-          <w:ilvl w:val="0"/>
-          <w:numId w:val="2"/>
-        </w:numPr>
-        <w:ind w:left="720" w:hanging="360"/>
-      </w:pPr>
-      <w:r>
-        <w:rPr>
-          <w:rtl w:val="0"/>
-        </w:rPr>
-        <w:t xml:space="preserve">High-severity SAST findings in sensitive categories</w:t>
-        <w:br w:type="textWrapping"/>
-      </w:r>
-    </w:p>
-    <w:p>
-      <w:pPr>
-        <w:rPr/>
-      </w:pPr>
-      <w:r>
-        <w:rPr>
-          <w:rtl w:val="0"/>
-        </w:rPr>
-        <w:t xml:space="preserve">These features are selected based on their direct relationship to exploitability, impact, and deployment risk.</w:t>
-      </w:r>
-    </w:p>
-    <w:p>
-      <w:pPr>
-        <w:rPr/>
-      </w:pPr>
-      <w:r>
-        <w:rPr>
-          <w:rtl w:val="0"/>
-        </w:rPr>
-        <w:t xml:space="preserve">The model must use only features with documented security relevance.</w:t>
-        <w:br w:type="textWrapping"/>
-      </w:r>
-    </w:p>
-    <w:p>
-      <w:pPr>
-        <w:spacing w:after="360" w:lineRule="auto"/>
+          <w:numId w:val="8"/>
+        </w:numPr>
+        <w:ind w:left="720" w:hanging="360"/>
+        <w:rPr>
+          <w:u w:val="none"/>
+        </w:rPr>
+      </w:pPr>
+      <w:r>
+        <w:rPr>
+          <w:rtl w:val="0"/>
+        </w:rPr>
+        <w:t xml:space="preserve">Be restricted to authorized reviewers.</w:t>
+      </w:r>
+    </w:p>
+    <w:p>
+      <w:pPr>
         <w:rPr/>
       </w:pPr>
       <w:r>
@@ -3444,57 +3157,178 @@
     </w:p>
     <w:p>
       <w:pPr>
-        <w:pStyle w:val="Heading1"/>
-        <w:rPr/>
-      </w:pPr>
-      <w:bookmarkStart w:colFirst="0" w:colLast="0" w:name="_rwke1uf6vboj" w:id="27"/>
-      <w:bookmarkEnd w:id="27"/>
-      <w:r>
-        <w:rPr>
-          <w:rtl w:val="0"/>
-        </w:rPr>
-        <w:t xml:space="preserve">5. Non-Functional Requirements</w:t>
-      </w:r>
-    </w:p>
-    <w:p>
-      <w:pPr>
         <w:pStyle w:val="Heading2"/>
         <w:rPr/>
       </w:pPr>
-      <w:bookmarkStart w:colFirst="0" w:colLast="0" w:name="_cmas34fri7wu" w:id="28"/>
-      <w:bookmarkEnd w:id="28"/>
-      <w:r>
-        <w:rPr>
-          <w:rtl w:val="0"/>
-        </w:rPr>
-        <w:t xml:space="preserve">NFR-1 Decision Latency</w:t>
-      </w:r>
-    </w:p>
-    <w:p>
-      <w:pPr>
-        <w:rPr/>
-      </w:pPr>
-      <w:r>
-        <w:rPr>
-          <w:rtl w:val="0"/>
-        </w:rPr>
-        <w:t xml:space="preserve">The total risk decision time (scan + inference + enforcement) must be measurable and should not introduce unreasonable delay relative to total build time.</w:t>
-      </w:r>
-    </w:p>
-    <w:p>
-      <w:pPr>
-        <w:rPr/>
-      </w:pPr>
-      <w:r>
-        <w:rPr>
-          <w:rtl w:val="0"/>
-        </w:rPr>
-      </w:r>
-    </w:p>
-    <w:p>
-      <w:pPr>
-        <w:spacing w:after="360" w:lineRule="auto"/>
-        <w:rPr/>
+      <w:bookmarkStart w:colFirst="0" w:colLast="0" w:name="_lm2re6l1fk4r" w:id="23"/>
+      <w:bookmarkEnd w:id="23"/>
+      <w:r>
+        <w:rPr>
+          <w:rtl w:val="0"/>
+        </w:rPr>
+        <w:t xml:space="preserve">FR-10 Compliance Logging</w:t>
+      </w:r>
+    </w:p>
+    <w:p>
+      <w:pPr>
+        <w:rPr/>
+      </w:pPr>
+      <w:r>
+        <w:rPr>
+          <w:rtl w:val="0"/>
+        </w:rPr>
+        <w:t xml:space="preserve">The system shall retain, per build execution:</w:t>
+        <w:br w:type="textWrapping"/>
+      </w:r>
+    </w:p>
+    <w:p>
+      <w:pPr>
+        <w:numPr>
+          <w:ilvl w:val="0"/>
+          <w:numId w:val="11"/>
+        </w:numPr>
+        <w:ind w:left="720" w:hanging="360"/>
+      </w:pPr>
+      <w:r>
+        <w:rPr>
+          <w:rtl w:val="0"/>
+        </w:rPr>
+        <w:t xml:space="preserve">Scan outputs</w:t>
+      </w:r>
+    </w:p>
+    <w:p>
+      <w:pPr>
+        <w:numPr>
+          <w:ilvl w:val="0"/>
+          <w:numId w:val="11"/>
+        </w:numPr>
+        <w:ind w:left="720" w:hanging="360"/>
+      </w:pPr>
+      <w:r>
+        <w:rPr>
+          <w:rtl w:val="0"/>
+        </w:rPr>
+        <w:t xml:space="preserve">SBOM artifacts</w:t>
+      </w:r>
+    </w:p>
+    <w:p>
+      <w:pPr>
+        <w:numPr>
+          <w:ilvl w:val="0"/>
+          <w:numId w:val="11"/>
+        </w:numPr>
+        <w:ind w:left="720" w:hanging="360"/>
+      </w:pPr>
+      <w:r>
+        <w:rPr>
+          <w:rtl w:val="0"/>
+        </w:rPr>
+        <w:t xml:space="preserve">ML classification decisions</w:t>
+      </w:r>
+    </w:p>
+    <w:p>
+      <w:pPr>
+        <w:numPr>
+          <w:ilvl w:val="0"/>
+          <w:numId w:val="11"/>
+        </w:numPr>
+        <w:ind w:left="720" w:hanging="360"/>
+      </w:pPr>
+      <w:r>
+        <w:rPr>
+          <w:rtl w:val="0"/>
+        </w:rPr>
+        <w:t xml:space="preserve">Enforcement actions</w:t>
+      </w:r>
+    </w:p>
+    <w:p>
+      <w:pPr>
+        <w:numPr>
+          <w:ilvl w:val="0"/>
+          <w:numId w:val="11"/>
+        </w:numPr>
+        <w:ind w:left="720" w:hanging="360"/>
+      </w:pPr>
+      <w:r>
+        <w:rPr>
+          <w:rtl w:val="0"/>
+        </w:rPr>
+        <w:t xml:space="preserve">Extracted feature vector</w:t>
+      </w:r>
+    </w:p>
+    <w:p>
+      <w:pPr>
+        <w:numPr>
+          <w:ilvl w:val="0"/>
+          <w:numId w:val="11"/>
+        </w:numPr>
+        <w:ind w:left="720" w:hanging="360"/>
+      </w:pPr>
+      <w:r>
+        <w:rPr>
+          <w:rtl w:val="0"/>
+        </w:rPr>
+        <w:t xml:space="preserve">Manual override records (if applicable)</w:t>
+      </w:r>
+    </w:p>
+    <w:p>
+      <w:pPr>
+        <w:numPr>
+          <w:ilvl w:val="0"/>
+          <w:numId w:val="11"/>
+        </w:numPr>
+        <w:ind w:left="720" w:hanging="360"/>
+      </w:pPr>
+      <w:r>
+        <w:rPr>
+          <w:rtl w:val="0"/>
+        </w:rPr>
+        <w:t xml:space="preserve">Timestamped enforcement decision</w:t>
+      </w:r>
+    </w:p>
+    <w:p>
+      <w:pPr>
+        <w:rPr/>
+      </w:pPr>
+      <w:r>
+        <w:rPr>
+          <w:rtl w:val="0"/>
+        </w:rPr>
+        <w:t xml:space="preserve"> </w:t>
+      </w:r>
+    </w:p>
+    <w:p>
+      <w:pPr>
+        <w:rPr/>
+      </w:pPr>
+      <w:r>
+        <w:rPr>
+          <w:rtl w:val="0"/>
+        </w:rPr>
+        <w:t xml:space="preserve">All retained artifacts must support audit traceability.</w:t>
+      </w:r>
+    </w:p>
+    <w:p>
+      <w:pPr>
+        <w:ind w:left="0" w:firstLine="0"/>
+        <w:rPr>
+          <w:sz w:val="18"/>
+          <w:szCs w:val="18"/>
+        </w:rPr>
+      </w:pPr>
+      <w:r>
+        <w:rPr>
+          <w:rtl w:val="0"/>
+        </w:rPr>
+      </w:r>
+    </w:p>
+    <w:p>
+      <w:pPr>
+        <w:ind w:left="0" w:firstLine="0"/>
+        <w:rPr>
+          <w:sz w:val="18"/>
+          <w:szCs w:val="18"/>
+        </w:rPr>
       </w:pPr>
       <w:r>
         <w:pict>
@@ -3512,75 +3346,28 @@
         <w:pStyle w:val="Heading2"/>
         <w:rPr/>
       </w:pPr>
-      <w:bookmarkStart w:colFirst="0" w:colLast="0" w:name="_i6s6418bm054" w:id="29"/>
-      <w:bookmarkEnd w:id="29"/>
-      <w:r>
-        <w:rPr>
-          <w:rtl w:val="0"/>
-        </w:rPr>
-        <w:t xml:space="preserve">NFR-2 Auditability and Traceability</w:t>
-      </w:r>
-    </w:p>
-    <w:p>
-      <w:pPr>
-        <w:rPr/>
-      </w:pPr>
-      <w:r>
-        <w:rPr>
-          <w:rtl w:val="0"/>
-        </w:rPr>
-        <w:t xml:space="preserve">All pipeline decisions must be traceable to:</w:t>
-        <w:br w:type="textWrapping"/>
-      </w:r>
-    </w:p>
-    <w:p>
-      <w:pPr>
-        <w:numPr>
-          <w:ilvl w:val="0"/>
-          <w:numId w:val="16"/>
-        </w:numPr>
-        <w:ind w:left="720" w:hanging="360"/>
-      </w:pPr>
-      <w:r>
-        <w:rPr>
-          <w:rtl w:val="0"/>
-        </w:rPr>
-        <w:t xml:space="preserve">tool outputs</w:t>
-      </w:r>
-    </w:p>
-    <w:p>
-      <w:pPr>
-        <w:numPr>
-          <w:ilvl w:val="0"/>
-          <w:numId w:val="16"/>
-        </w:numPr>
-        <w:ind w:left="720" w:hanging="360"/>
-      </w:pPr>
-      <w:r>
-        <w:rPr>
-          <w:rtl w:val="0"/>
-        </w:rPr>
-        <w:t xml:space="preserve">model inputs</w:t>
-      </w:r>
-    </w:p>
-    <w:p>
-      <w:pPr>
-        <w:numPr>
-          <w:ilvl w:val="0"/>
-          <w:numId w:val="16"/>
-        </w:numPr>
-        <w:ind w:left="720" w:hanging="360"/>
-      </w:pPr>
-      <w:r>
-        <w:rPr>
-          <w:rtl w:val="0"/>
-        </w:rPr>
-        <w:t xml:space="preserve">enforcement outcomes</w:t>
-      </w:r>
-    </w:p>
-    <w:p>
-      <w:pPr>
-        <w:spacing w:after="360" w:lineRule="auto"/>
+      <w:bookmarkStart w:colFirst="0" w:colLast="0" w:name="_8iidmr4hzrpq" w:id="24"/>
+      <w:bookmarkEnd w:id="24"/>
+      <w:r>
+        <w:rPr>
+          <w:rtl w:val="0"/>
+        </w:rPr>
+        <w:t xml:space="preserve">FR-11 Feature Extraction and Normalization</w:t>
+      </w:r>
+    </w:p>
+    <w:p>
+      <w:pPr>
+        <w:rPr/>
+      </w:pPr>
+      <w:r>
+        <w:rPr>
+          <w:rtl w:val="0"/>
+        </w:rPr>
+        <w:t xml:space="preserve">The system shall extract security-relevant statistics from SBOM, vulnerability, and SAST outputs and normalize them into a fixed feature vector schema for ML classification.</w:t>
+      </w:r>
+    </w:p>
+    <w:p>
+      <w:pPr>
         <w:rPr/>
       </w:pPr>
       <w:r>
@@ -3597,32 +3384,43 @@
     <w:p>
       <w:pPr>
         <w:pStyle w:val="Heading2"/>
-        <w:rPr/>
-      </w:pPr>
-      <w:bookmarkStart w:colFirst="0" w:colLast="0" w:name="_7udosaceyu77" w:id="30"/>
-      <w:bookmarkEnd w:id="30"/>
-      <w:r>
-        <w:rPr>
-          <w:rtl w:val="0"/>
-        </w:rPr>
-        <w:t xml:space="preserve">NFR-3 Extensibility</w:t>
-      </w:r>
-    </w:p>
-    <w:p>
-      <w:pPr>
-        <w:rPr/>
-      </w:pPr>
-      <w:r>
-        <w:rPr>
-          <w:rtl w:val="0"/>
-        </w:rPr>
-        <w:t xml:space="preserve">The system must support modular substitution of scanning tools or ML models.</w:t>
-      </w:r>
-    </w:p>
-    <w:p>
-      <w:pPr>
         <w:spacing w:after="360" w:lineRule="auto"/>
         <w:rPr/>
+      </w:pPr>
+      <w:bookmarkStart w:colFirst="0" w:colLast="0" w:name="_cbeydtk1xuo9" w:id="25"/>
+      <w:bookmarkEnd w:id="25"/>
+      <w:r>
+        <w:rPr>
+          <w:rtl w:val="0"/>
+        </w:rPr>
+        <w:t xml:space="preserve">FR-12 Compliance – SBOM Transparency</w:t>
+      </w:r>
+    </w:p>
+    <w:p>
+      <w:pPr>
+        <w:rPr>
+          <w:sz w:val="18"/>
+          <w:szCs w:val="18"/>
+        </w:rPr>
+      </w:pPr>
+      <w:r>
+        <w:rPr>
+          <w:rtl w:val="0"/>
+        </w:rPr>
+        <w:t xml:space="preserve">The system shall generate machine-readable SBOMs for each build in alignment with EO 14028 requirements.</w:t>
+      </w:r>
+      <w:r>
+        <w:rPr>
+          <w:rtl w:val="0"/>
+        </w:rPr>
+      </w:r>
+    </w:p>
+    <w:p>
+      <w:pPr>
+        <w:rPr>
+          <w:sz w:val="18"/>
+          <w:szCs w:val="18"/>
+        </w:rPr>
       </w:pPr>
       <w:r>
         <w:pict>
@@ -3638,32 +3436,35 @@
     <w:p>
       <w:pPr>
         <w:pStyle w:val="Heading2"/>
-        <w:rPr/>
-      </w:pPr>
-      <w:bookmarkStart w:colFirst="0" w:colLast="0" w:name="_419gs4v0lcdg" w:id="31"/>
-      <w:bookmarkEnd w:id="31"/>
-      <w:r>
-        <w:rPr>
-          <w:rtl w:val="0"/>
-        </w:rPr>
-        <w:t xml:space="preserve">NFR-4 Secure Artifact Retention</w:t>
-      </w:r>
-    </w:p>
-    <w:p>
-      <w:pPr>
-        <w:rPr/>
-      </w:pPr>
-      <w:r>
-        <w:rPr>
-          <w:rtl w:val="0"/>
-        </w:rPr>
-        <w:t xml:space="preserve">Logs and artifacts must be stored securely and protected against tampering.</w:t>
-      </w:r>
-    </w:p>
-    <w:p>
-      <w:pPr>
         <w:spacing w:after="360" w:lineRule="auto"/>
         <w:rPr/>
+      </w:pPr>
+      <w:bookmarkStart w:colFirst="0" w:colLast="0" w:name="_kizdwkh7cuhn" w:id="26"/>
+      <w:bookmarkEnd w:id="26"/>
+      <w:r>
+        <w:rPr>
+          <w:rtl w:val="0"/>
+        </w:rPr>
+        <w:t xml:space="preserve">FR-13 Compliance – Secure Build Practices</w:t>
+      </w:r>
+    </w:p>
+    <w:p>
+      <w:pPr>
+        <w:rPr/>
+      </w:pPr>
+      <w:r>
+        <w:rPr>
+          <w:rtl w:val="0"/>
+        </w:rPr>
+        <w:t xml:space="preserve">The system shall enforce vulnerability scanning and risk-based gating prior to deployment.</w:t>
+      </w:r>
+    </w:p>
+    <w:p>
+      <w:pPr>
+        <w:rPr>
+          <w:sz w:val="18"/>
+          <w:szCs w:val="18"/>
+        </w:rPr>
       </w:pPr>
       <w:r>
         <w:pict>
@@ -3679,32 +3480,35 @@
     <w:p>
       <w:pPr>
         <w:pStyle w:val="Heading2"/>
-        <w:rPr/>
-      </w:pPr>
-      <w:bookmarkStart w:colFirst="0" w:colLast="0" w:name="_fu8ormlowllw" w:id="32"/>
-      <w:bookmarkEnd w:id="32"/>
-      <w:r>
-        <w:rPr>
-          <w:rtl w:val="0"/>
-        </w:rPr>
-        <w:t xml:space="preserve">NFR-5 Model Transparency</w:t>
-      </w:r>
-    </w:p>
-    <w:p>
-      <w:pPr>
-        <w:rPr/>
-      </w:pPr>
-      <w:r>
-        <w:rPr>
-          <w:rtl w:val="0"/>
-        </w:rPr>
-        <w:t xml:space="preserve">The system must ensure that ML-based decisions are explainable and auditable. The decision logic must be interpretable (e.g., decision tree or rule-based explanation), and opaque black-box models are not permitted in the prototype.</w:t>
-      </w:r>
-    </w:p>
-    <w:p>
-      <w:pPr>
         <w:spacing w:after="360" w:lineRule="auto"/>
         <w:rPr/>
+      </w:pPr>
+      <w:bookmarkStart w:colFirst="0" w:colLast="0" w:name="_au63b6etmhwa" w:id="27"/>
+      <w:bookmarkEnd w:id="27"/>
+      <w:r>
+        <w:rPr>
+          <w:rtl w:val="0"/>
+        </w:rPr>
+        <w:t xml:space="preserve">FR-14 SBOM Dependency Completeness</w:t>
+      </w:r>
+    </w:p>
+    <w:p>
+      <w:pPr>
+        <w:rPr/>
+      </w:pPr>
+      <w:r>
+        <w:rPr>
+          <w:rtl w:val="0"/>
+        </w:rPr>
+        <w:t xml:space="preserve">The SBOM shall explicitly distinguish between components with no dependencies and components with unknown or incomplete dependency information.</w:t>
+      </w:r>
+    </w:p>
+    <w:p>
+      <w:pPr>
+        <w:rPr>
+          <w:sz w:val="18"/>
+          <w:szCs w:val="18"/>
+        </w:rPr>
       </w:pPr>
       <w:r>
         <w:pict>
@@ -3720,26 +3524,28 @@
     <w:p>
       <w:pPr>
         <w:pStyle w:val="Heading2"/>
-        <w:rPr/>
-      </w:pPr>
-      <w:bookmarkStart w:colFirst="0" w:colLast="0" w:name="_1e48a2jjv5pu" w:id="33"/>
-      <w:bookmarkEnd w:id="33"/>
-      <w:r>
-        <w:rPr>
-          <w:rtl w:val="0"/>
-        </w:rPr>
-        <w:t xml:space="preserve">NFR-6 Artifact Integrity</w:t>
-      </w:r>
-    </w:p>
-    <w:p>
-      <w:pPr>
-        <w:rPr/>
-      </w:pPr>
-      <w:r>
-        <w:rPr>
-          <w:rtl w:val="0"/>
-        </w:rPr>
-        <w:t xml:space="preserve">All retained artifacts must be protected against tampering. Artifact storage must ensure integrity verification and controlled access. Integrity verification mechanisms (e.g., checksums or hash validation) must be used to ensure artifact immutability.</w:t>
+        <w:spacing w:after="360" w:lineRule="auto"/>
+        <w:rPr/>
+      </w:pPr>
+      <w:bookmarkStart w:colFirst="0" w:colLast="0" w:name="_irklw09txa03" w:id="28"/>
+      <w:bookmarkEnd w:id="28"/>
+      <w:r>
+        <w:rPr>
+          <w:rtl w:val="0"/>
+        </w:rPr>
+        <w:t xml:space="preserve">FR-15 SBOM Integrity Verification</w:t>
+      </w:r>
+    </w:p>
+    <w:p>
+      <w:pPr>
+        <w:rPr/>
+      </w:pPr>
+      <w:r>
+        <w:rPr>
+          <w:rtl w:val="0"/>
+        </w:rPr>
+        <w:t xml:space="preserve">The system shall include cryptographic hashes for SBOM-listed components to support verification of exact component versions used in the build.</w:t>
+        <w:br w:type="textWrapping"/>
       </w:r>
     </w:p>
     <w:p>
@@ -3760,36 +3566,57 @@
     </w:p>
     <w:p>
       <w:pPr>
+        <w:pStyle w:val="Heading1"/>
+        <w:rPr/>
+      </w:pPr>
+      <w:bookmarkStart w:colFirst="0" w:colLast="0" w:name="_rwke1uf6vboj" w:id="29"/>
+      <w:bookmarkEnd w:id="29"/>
+      <w:r>
+        <w:rPr>
+          <w:rtl w:val="0"/>
+        </w:rPr>
+        <w:t xml:space="preserve">4. Non-Functional Requirements</w:t>
+      </w:r>
+    </w:p>
+    <w:p>
+      <w:pPr>
         <w:pStyle w:val="Heading2"/>
         <w:rPr/>
       </w:pPr>
-      <w:bookmarkStart w:colFirst="0" w:colLast="0" w:name="_i39gejxftpbs" w:id="34"/>
-      <w:bookmarkEnd w:id="34"/>
-      <w:r>
-        <w:rPr>
-          <w:rtl w:val="0"/>
-        </w:rPr>
-        <w:t xml:space="preserve">NFR-7 Reproducibility</w:t>
-      </w:r>
-    </w:p>
-    <w:p>
-      <w:pPr>
-        <w:rPr/>
-      </w:pPr>
-      <w:r>
-        <w:rPr>
-          <w:rtl w:val="0"/>
-        </w:rPr>
-        <w:t xml:space="preserve">Given identical inputs (scan outputs and feature vector), the ML inference process must produce consistent classification results.</w:t>
+      <w:bookmarkStart w:colFirst="0" w:colLast="0" w:name="_cmas34fri7wu" w:id="30"/>
+      <w:bookmarkEnd w:id="30"/>
+      <w:r>
+        <w:rPr>
+          <w:rtl w:val="0"/>
+        </w:rPr>
+        <w:t xml:space="preserve">NFR-1 Decision Latency</w:t>
+      </w:r>
+    </w:p>
+    <w:p>
+      <w:pPr>
+        <w:rPr/>
+      </w:pPr>
+      <w:r>
+        <w:rPr>
+          <w:rtl w:val="0"/>
+        </w:rPr>
+        <w:t xml:space="preserve">The total risk decision time (scan + inference + enforcement) must be measurable and should not introduce unreasonable delay relative to total build time.</w:t>
+      </w:r>
+    </w:p>
+    <w:p>
+      <w:pPr>
+        <w:rPr/>
+      </w:pPr>
+      <w:r>
+        <w:rPr>
+          <w:rtl w:val="0"/>
+        </w:rPr>
       </w:r>
     </w:p>
     <w:p>
       <w:pPr>
         <w:spacing w:after="360" w:lineRule="auto"/>
-        <w:rPr>
-          <w:sz w:val="18"/>
-          <w:szCs w:val="18"/>
-        </w:rPr>
+        <w:rPr/>
       </w:pPr>
       <w:r>
         <w:pict>
@@ -3804,501 +3631,80 @@
     </w:p>
     <w:p>
       <w:pPr>
-        <w:pStyle w:val="Heading1"/>
-        <w:rPr/>
-      </w:pPr>
-      <w:bookmarkStart w:colFirst="0" w:colLast="0" w:name="_hxrdza3frkqq" w:id="35"/>
-      <w:bookmarkEnd w:id="35"/>
-      <w:r>
-        <w:rPr>
-          <w:rtl w:val="0"/>
-        </w:rPr>
-      </w:r>
-    </w:p>
-    <w:p>
-      <w:pPr>
-        <w:pStyle w:val="Heading1"/>
-        <w:rPr/>
-      </w:pPr>
-      <w:bookmarkStart w:colFirst="0" w:colLast="0" w:name="_sghc5v552j2c" w:id="36"/>
-      <w:bookmarkEnd w:id="36"/>
-      <w:r>
-        <w:br w:type="page"/>
-      </w:r>
-      <w:r>
-        <w:rPr>
-          <w:rtl w:val="0"/>
-        </w:rPr>
-      </w:r>
-    </w:p>
-    <w:p>
-      <w:pPr>
-        <w:pStyle w:val="Heading1"/>
-        <w:rPr/>
-      </w:pPr>
-      <w:bookmarkStart w:colFirst="0" w:colLast="0" w:name="_837vljg801fc" w:id="37"/>
-      <w:bookmarkEnd w:id="37"/>
-      <w:r>
-        <w:rPr>
-          <w:rtl w:val="0"/>
-        </w:rPr>
-        <w:t xml:space="preserve">6. Compliance Requirements (EO 14028 Alignment)</w:t>
-      </w:r>
-    </w:p>
-    <w:p>
-      <w:pPr>
-        <w:rPr/>
-      </w:pPr>
-      <w:r>
-        <w:rPr>
-          <w:rtl w:val="0"/>
-        </w:rPr>
-        <w:t xml:space="preserve">The system will align with Executive Order 14028 through:</w:t>
-      </w:r>
-    </w:p>
-    <w:tbl>
-      <w:tblPr>
-        <w:tblStyle w:val="Table2"/>
-        <w:tblW w:w="8250.0" w:type="dxa"/>
-        <w:jc w:val="left"/>
-        <w:tblBorders>
-          <w:top w:color="000000" w:space="0" w:sz="0" w:val="nil"/>
-          <w:left w:color="000000" w:space="0" w:sz="0" w:val="nil"/>
-          <w:bottom w:color="000000" w:space="0" w:sz="0" w:val="nil"/>
-          <w:right w:color="000000" w:space="0" w:sz="0" w:val="nil"/>
-          <w:insideH w:color="000000" w:space="0" w:sz="0" w:val="nil"/>
-          <w:insideV w:color="000000" w:space="0" w:sz="0" w:val="nil"/>
-        </w:tblBorders>
-        <w:tblLayout w:type="fixed"/>
-        <w:tblLook w:val="0600"/>
-      </w:tblPr>
-      <w:tblGrid>
-        <w:gridCol w:w="3045"/>
-        <w:gridCol w:w="5205"/>
-        <w:tblGridChange w:id="0">
-          <w:tblGrid>
-            <w:gridCol w:w="3045"/>
-            <w:gridCol w:w="5205"/>
-          </w:tblGrid>
-        </w:tblGridChange>
-      </w:tblGrid>
-      <w:tr>
-        <w:trPr>
-          <w:cantSplit w:val="0"/>
-          <w:trHeight w:val="360" w:hRule="atLeast"/>
-          <w:tblHeader w:val="0"/>
-        </w:trPr>
-        <w:tc>
-          <w:tcPr>
-            <w:tcBorders>
-              <w:top w:color="000000" w:space="0" w:sz="4" w:val="single"/>
-              <w:left w:color="000000" w:space="0" w:sz="4" w:val="single"/>
-              <w:bottom w:color="000000" w:space="0" w:sz="4" w:val="single"/>
-              <w:right w:color="000000" w:space="0" w:sz="4" w:val="single"/>
-            </w:tcBorders>
-            <w:tcMar>
-              <w:top w:w="60.0" w:type="dxa"/>
-              <w:left w:w="60.0" w:type="dxa"/>
-              <w:bottom w:w="60.0" w:type="dxa"/>
-              <w:right w:w="60.0" w:type="dxa"/>
-            </w:tcMar>
-            <w:vAlign w:val="top"/>
-          </w:tcPr>
-          <w:p>
-            <w:pPr>
-              <w:spacing w:line="240" w:lineRule="auto"/>
-              <w:rPr>
-                <w:b w:val="1"/>
-                <w:bCs w:val="1"/>
-              </w:rPr>
-            </w:pPr>
-            <w:r>
-              <w:rPr>
-                <w:b w:val="1"/>
-                <w:bCs w:val="1"/>
-                <w:rtl w:val="0"/>
-              </w:rPr>
-              <w:t xml:space="preserve">EO 14028 Objective</w:t>
-            </w:r>
-          </w:p>
-        </w:tc>
-        <w:tc>
-          <w:tcPr>
-            <w:tcBorders>
-              <w:top w:color="000000" w:space="0" w:sz="4" w:val="single"/>
-              <w:left w:color="000000" w:space="0" w:sz="4" w:val="single"/>
-              <w:bottom w:color="000000" w:space="0" w:sz="4" w:val="single"/>
-              <w:right w:color="000000" w:space="0" w:sz="4" w:val="single"/>
-            </w:tcBorders>
-            <w:tcMar>
-              <w:top w:w="60.0" w:type="dxa"/>
-              <w:left w:w="60.0" w:type="dxa"/>
-              <w:bottom w:w="60.0" w:type="dxa"/>
-              <w:right w:w="60.0" w:type="dxa"/>
-            </w:tcMar>
-            <w:vAlign w:val="top"/>
-          </w:tcPr>
-          <w:p>
-            <w:pPr>
-              <w:spacing w:line="240" w:lineRule="auto"/>
-              <w:rPr>
-                <w:b w:val="1"/>
-                <w:bCs w:val="1"/>
-              </w:rPr>
-            </w:pPr>
-            <w:r>
-              <w:rPr>
-                <w:b w:val="1"/>
-                <w:bCs w:val="1"/>
-                <w:rtl w:val="0"/>
-              </w:rPr>
-              <w:t xml:space="preserve">Pipeline Control</w:t>
-            </w:r>
-          </w:p>
-        </w:tc>
-      </w:tr>
-      <w:tr>
-        <w:trPr>
-          <w:cantSplit w:val="0"/>
-          <w:trHeight w:val="570" w:hRule="atLeast"/>
-          <w:tblHeader w:val="0"/>
-        </w:trPr>
-        <w:tc>
-          <w:tcPr>
-            <w:tcBorders>
-              <w:top w:color="000000" w:space="0" w:sz="4" w:val="single"/>
-              <w:left w:color="000000" w:space="0" w:sz="4" w:val="single"/>
-              <w:bottom w:color="000000" w:space="0" w:sz="4" w:val="single"/>
-              <w:right w:color="000000" w:space="0" w:sz="4" w:val="single"/>
-            </w:tcBorders>
-            <w:tcMar>
-              <w:top w:w="60.0" w:type="dxa"/>
-              <w:left w:w="60.0" w:type="dxa"/>
-              <w:bottom w:w="60.0" w:type="dxa"/>
-              <w:right w:w="60.0" w:type="dxa"/>
-            </w:tcMar>
-            <w:vAlign w:val="top"/>
-          </w:tcPr>
-          <w:p>
-            <w:pPr>
-              <w:spacing w:line="240" w:lineRule="auto"/>
-              <w:rPr/>
-            </w:pPr>
-            <w:r>
-              <w:rPr>
-                <w:rtl w:val="0"/>
-              </w:rPr>
-              <w:t xml:space="preserve">SBOM Transparency</w:t>
-            </w:r>
-          </w:p>
-        </w:tc>
-        <w:tc>
-          <w:tcPr>
-            <w:tcBorders>
-              <w:top w:color="000000" w:space="0" w:sz="4" w:val="single"/>
-              <w:left w:color="000000" w:space="0" w:sz="4" w:val="single"/>
-              <w:bottom w:color="000000" w:space="0" w:sz="4" w:val="single"/>
-              <w:right w:color="000000" w:space="0" w:sz="4" w:val="single"/>
-            </w:tcBorders>
-            <w:tcMar>
-              <w:top w:w="60.0" w:type="dxa"/>
-              <w:left w:w="60.0" w:type="dxa"/>
-              <w:bottom w:w="60.0" w:type="dxa"/>
-              <w:right w:w="60.0" w:type="dxa"/>
-            </w:tcMar>
-            <w:vAlign w:val="top"/>
-          </w:tcPr>
-          <w:p>
-            <w:pPr>
-              <w:spacing w:line="240" w:lineRule="auto"/>
-              <w:rPr/>
-            </w:pPr>
-            <w:r>
-              <w:rPr>
-                <w:rtl w:val="0"/>
-              </w:rPr>
-              <w:t xml:space="preserve">Automated SBOM generation per build</w:t>
-            </w:r>
-          </w:p>
-        </w:tc>
-      </w:tr>
-      <w:tr>
-        <w:trPr>
-          <w:cantSplit w:val="0"/>
-          <w:trHeight w:val="570" w:hRule="atLeast"/>
-          <w:tblHeader w:val="0"/>
-        </w:trPr>
-        <w:tc>
-          <w:tcPr>
-            <w:tcBorders>
-              <w:top w:color="000000" w:space="0" w:sz="4" w:val="single"/>
-              <w:left w:color="000000" w:space="0" w:sz="4" w:val="single"/>
-              <w:bottom w:color="000000" w:space="0" w:sz="4" w:val="single"/>
-              <w:right w:color="000000" w:space="0" w:sz="4" w:val="single"/>
-            </w:tcBorders>
-            <w:tcMar>
-              <w:top w:w="60.0" w:type="dxa"/>
-              <w:left w:w="60.0" w:type="dxa"/>
-              <w:bottom w:w="60.0" w:type="dxa"/>
-              <w:right w:w="60.0" w:type="dxa"/>
-            </w:tcMar>
-            <w:vAlign w:val="top"/>
-          </w:tcPr>
-          <w:p>
-            <w:pPr>
-              <w:spacing w:line="240" w:lineRule="auto"/>
-              <w:rPr/>
-            </w:pPr>
-            <w:r>
-              <w:rPr>
-                <w:rtl w:val="0"/>
-              </w:rPr>
-              <w:t xml:space="preserve">Supply Chain Integrity</w:t>
-            </w:r>
-          </w:p>
-        </w:tc>
-        <w:tc>
-          <w:tcPr>
-            <w:tcBorders>
-              <w:top w:color="000000" w:space="0" w:sz="4" w:val="single"/>
-              <w:left w:color="000000" w:space="0" w:sz="4" w:val="single"/>
-              <w:bottom w:color="000000" w:space="0" w:sz="4" w:val="single"/>
-              <w:right w:color="000000" w:space="0" w:sz="4" w:val="single"/>
-            </w:tcBorders>
-            <w:tcMar>
-              <w:top w:w="60.0" w:type="dxa"/>
-              <w:left w:w="60.0" w:type="dxa"/>
-              <w:bottom w:w="60.0" w:type="dxa"/>
-              <w:right w:w="60.0" w:type="dxa"/>
-            </w:tcMar>
-            <w:vAlign w:val="top"/>
-          </w:tcPr>
-          <w:p>
-            <w:pPr>
-              <w:spacing w:line="240" w:lineRule="auto"/>
-              <w:rPr/>
-            </w:pPr>
-            <w:r>
-              <w:rPr>
-                <w:rtl w:val="0"/>
-              </w:rPr>
-              <w:t xml:space="preserve">Vulnerability scanning + enforcement gate</w:t>
-            </w:r>
-          </w:p>
-        </w:tc>
-      </w:tr>
-      <w:tr>
-        <w:trPr>
-          <w:cantSplit w:val="0"/>
-          <w:trHeight w:val="570" w:hRule="atLeast"/>
-          <w:tblHeader w:val="0"/>
-        </w:trPr>
-        <w:tc>
-          <w:tcPr>
-            <w:tcBorders>
-              <w:top w:color="000000" w:space="0" w:sz="4" w:val="single"/>
-              <w:left w:color="000000" w:space="0" w:sz="4" w:val="single"/>
-              <w:bottom w:color="000000" w:space="0" w:sz="4" w:val="single"/>
-              <w:right w:color="000000" w:space="0" w:sz="4" w:val="single"/>
-            </w:tcBorders>
-            <w:tcMar>
-              <w:top w:w="60.0" w:type="dxa"/>
-              <w:left w:w="60.0" w:type="dxa"/>
-              <w:bottom w:w="60.0" w:type="dxa"/>
-              <w:right w:w="60.0" w:type="dxa"/>
-            </w:tcMar>
-            <w:vAlign w:val="top"/>
-          </w:tcPr>
-          <w:p>
-            <w:pPr>
-              <w:spacing w:line="240" w:lineRule="auto"/>
-              <w:rPr/>
-            </w:pPr>
-            <w:r>
-              <w:rPr>
-                <w:rtl w:val="0"/>
-              </w:rPr>
-              <w:t xml:space="preserve">Secure Build Practices</w:t>
-            </w:r>
-          </w:p>
-        </w:tc>
-        <w:tc>
-          <w:tcPr>
-            <w:tcBorders>
-              <w:top w:color="000000" w:space="0" w:sz="4" w:val="single"/>
-              <w:left w:color="000000" w:space="0" w:sz="4" w:val="single"/>
-              <w:bottom w:color="000000" w:space="0" w:sz="4" w:val="single"/>
-              <w:right w:color="000000" w:space="0" w:sz="4" w:val="single"/>
-            </w:tcBorders>
-            <w:tcMar>
-              <w:top w:w="60.0" w:type="dxa"/>
-              <w:left w:w="60.0" w:type="dxa"/>
-              <w:bottom w:w="60.0" w:type="dxa"/>
-              <w:right w:w="60.0" w:type="dxa"/>
-            </w:tcMar>
-            <w:vAlign w:val="top"/>
-          </w:tcPr>
-          <w:p>
-            <w:pPr>
-              <w:spacing w:line="240" w:lineRule="auto"/>
-              <w:rPr/>
-            </w:pPr>
-            <w:r>
-              <w:rPr>
-                <w:rtl w:val="0"/>
-              </w:rPr>
-              <w:t xml:space="preserve">Hardened GitHub Actions workflow</w:t>
-            </w:r>
-          </w:p>
-        </w:tc>
-      </w:tr>
-      <w:tr>
-        <w:trPr>
-          <w:cantSplit w:val="0"/>
-          <w:trHeight w:val="570" w:hRule="atLeast"/>
-          <w:tblHeader w:val="0"/>
-        </w:trPr>
-        <w:tc>
-          <w:tcPr>
-            <w:tcBorders>
-              <w:top w:color="000000" w:space="0" w:sz="4" w:val="single"/>
-              <w:left w:color="000000" w:space="0" w:sz="4" w:val="single"/>
-              <w:bottom w:color="000000" w:space="0" w:sz="4" w:val="single"/>
-              <w:right w:color="000000" w:space="0" w:sz="4" w:val="single"/>
-            </w:tcBorders>
-            <w:tcMar>
-              <w:top w:w="60.0" w:type="dxa"/>
-              <w:left w:w="60.0" w:type="dxa"/>
-              <w:bottom w:w="60.0" w:type="dxa"/>
-              <w:right w:w="60.0" w:type="dxa"/>
-            </w:tcMar>
-            <w:vAlign w:val="top"/>
-          </w:tcPr>
-          <w:p>
-            <w:pPr>
-              <w:spacing w:line="240" w:lineRule="auto"/>
-              <w:rPr/>
-            </w:pPr>
-            <w:r>
-              <w:rPr>
-                <w:rtl w:val="0"/>
-              </w:rPr>
-              <w:t xml:space="preserve">Audit Evidence</w:t>
-            </w:r>
-          </w:p>
-        </w:tc>
-        <w:tc>
-          <w:tcPr>
-            <w:tcBorders>
-              <w:top w:color="000000" w:space="0" w:sz="4" w:val="single"/>
-              <w:left w:color="000000" w:space="0" w:sz="4" w:val="single"/>
-              <w:bottom w:color="000000" w:space="0" w:sz="4" w:val="single"/>
-              <w:right w:color="000000" w:space="0" w:sz="4" w:val="single"/>
-            </w:tcBorders>
-            <w:tcMar>
-              <w:top w:w="60.0" w:type="dxa"/>
-              <w:left w:w="60.0" w:type="dxa"/>
-              <w:bottom w:w="60.0" w:type="dxa"/>
-              <w:right w:w="60.0" w:type="dxa"/>
-            </w:tcMar>
-            <w:vAlign w:val="top"/>
-          </w:tcPr>
-          <w:p>
-            <w:pPr>
-              <w:spacing w:line="240" w:lineRule="auto"/>
-              <w:rPr/>
-            </w:pPr>
-            <w:r>
-              <w:rPr>
-                <w:rtl w:val="0"/>
-              </w:rPr>
-              <w:t xml:space="preserve">Immutable logging + artifact retention</w:t>
-            </w:r>
-          </w:p>
-        </w:tc>
-      </w:tr>
-      <w:tr>
-        <w:trPr>
-          <w:cantSplit w:val="0"/>
-          <w:trHeight w:val="570" w:hRule="atLeast"/>
-          <w:tblHeader w:val="0"/>
-        </w:trPr>
-        <w:tc>
-          <w:tcPr>
-            <w:tcBorders>
-              <w:top w:color="000000" w:space="0" w:sz="4" w:val="single"/>
-              <w:left w:color="000000" w:space="0" w:sz="4" w:val="single"/>
-              <w:bottom w:color="000000" w:space="0" w:sz="4" w:val="single"/>
-              <w:right w:color="000000" w:space="0" w:sz="4" w:val="single"/>
-            </w:tcBorders>
-            <w:tcMar>
-              <w:top w:w="60.0" w:type="dxa"/>
-              <w:left w:w="60.0" w:type="dxa"/>
-              <w:bottom w:w="60.0" w:type="dxa"/>
-              <w:right w:w="60.0" w:type="dxa"/>
-            </w:tcMar>
-            <w:vAlign w:val="top"/>
-          </w:tcPr>
-          <w:p>
-            <w:pPr>
-              <w:spacing w:line="240" w:lineRule="auto"/>
-              <w:rPr/>
-            </w:pPr>
-            <w:r>
-              <w:rPr>
-                <w:rtl w:val="0"/>
-              </w:rPr>
-              <w:t xml:space="preserve">Model Governance</w:t>
-            </w:r>
-          </w:p>
-        </w:tc>
-        <w:tc>
-          <w:tcPr>
-            <w:tcBorders>
-              <w:top w:color="000000" w:space="0" w:sz="4" w:val="single"/>
-              <w:left w:color="000000" w:space="0" w:sz="4" w:val="single"/>
-              <w:bottom w:color="000000" w:space="0" w:sz="4" w:val="single"/>
-              <w:right w:color="000000" w:space="0" w:sz="4" w:val="single"/>
-            </w:tcBorders>
-            <w:tcMar>
-              <w:top w:w="60.0" w:type="dxa"/>
-              <w:left w:w="60.0" w:type="dxa"/>
-              <w:bottom w:w="60.0" w:type="dxa"/>
-              <w:right w:w="60.0" w:type="dxa"/>
-            </w:tcMar>
-            <w:vAlign w:val="top"/>
-          </w:tcPr>
-          <w:p>
-            <w:pPr>
-              <w:spacing w:line="240" w:lineRule="auto"/>
-              <w:rPr/>
-            </w:pPr>
-            <w:r>
-              <w:rPr>
-                <w:rtl w:val="0"/>
-              </w:rPr>
-              <w:t xml:space="preserve">Version-controlled ML model with logged decision traceability</w:t>
-            </w:r>
-          </w:p>
-        </w:tc>
-      </w:tr>
-    </w:tbl>
-    <w:p>
-      <w:pPr>
-        <w:spacing w:after="160" w:lineRule="auto"/>
-        <w:rPr>
-          <w:sz w:val="18"/>
-          <w:szCs w:val="18"/>
-        </w:rPr>
-      </w:pPr>
-      <w:r>
-        <w:rPr>
-          <w:sz w:val="18"/>
-          <w:szCs w:val="18"/>
-          <w:rtl w:val="0"/>
-        </w:rPr>
-        <w:t xml:space="preserve"> </w:t>
-      </w:r>
+        <w:pStyle w:val="Heading2"/>
+        <w:rPr/>
+      </w:pPr>
+      <w:bookmarkStart w:colFirst="0" w:colLast="0" w:name="_i6s6418bm054" w:id="31"/>
+      <w:bookmarkEnd w:id="31"/>
+      <w:r>
+        <w:rPr>
+          <w:rtl w:val="0"/>
+        </w:rPr>
+        <w:t xml:space="preserve">NFR-2 Auditability and Traceability</w:t>
+      </w:r>
+    </w:p>
+    <w:p>
+      <w:pPr>
+        <w:rPr/>
+      </w:pPr>
+      <w:r>
+        <w:rPr>
+          <w:rtl w:val="0"/>
+        </w:rPr>
+        <w:t xml:space="preserve">All pipeline decisions must be traceable to:</w:t>
+        <w:br w:type="textWrapping"/>
+      </w:r>
+    </w:p>
+    <w:p>
+      <w:pPr>
+        <w:numPr>
+          <w:ilvl w:val="0"/>
+          <w:numId w:val="15"/>
+        </w:numPr>
+        <w:ind w:left="720" w:hanging="360"/>
+      </w:pPr>
+      <w:r>
+        <w:rPr>
+          <w:rtl w:val="0"/>
+        </w:rPr>
+        <w:t xml:space="preserve">tool outputs</w:t>
+      </w:r>
+    </w:p>
+    <w:p>
+      <w:pPr>
+        <w:numPr>
+          <w:ilvl w:val="0"/>
+          <w:numId w:val="15"/>
+        </w:numPr>
+        <w:ind w:left="720" w:hanging="360"/>
+      </w:pPr>
+      <w:r>
+        <w:rPr>
+          <w:rtl w:val="0"/>
+        </w:rPr>
+        <w:t xml:space="preserve">model inputs</w:t>
+      </w:r>
+    </w:p>
+    <w:p>
+      <w:pPr>
+        <w:numPr>
+          <w:ilvl w:val="0"/>
+          <w:numId w:val="15"/>
+        </w:numPr>
+        <w:ind w:left="720" w:hanging="360"/>
+      </w:pPr>
+      <w:r>
+        <w:rPr>
+          <w:rtl w:val="0"/>
+        </w:rPr>
+        <w:t xml:space="preserve">enforcement outcomes</w:t>
+      </w:r>
+    </w:p>
+    <w:p>
+      <w:pPr>
+        <w:spacing w:after="360" w:lineRule="auto"/>
+        <w:rPr/>
+      </w:pPr>
       <w:r>
         <w:pict>
           <v:rect style="width:0.0pt;height:1.5pt" o:hr="t" o:hrstd="t" o:hralign="center" fillcolor="#A0A0A0" stroked="f"/>
@@ -4312,109 +3718,81 @@
     </w:p>
     <w:p>
       <w:pPr>
-        <w:pStyle w:val="Heading1"/>
-        <w:rPr/>
-      </w:pPr>
-      <w:bookmarkStart w:colFirst="0" w:colLast="0" w:name="_rtfb0kx845ua" w:id="38"/>
-      <w:bookmarkEnd w:id="38"/>
-      <w:r>
-        <w:rPr>
-          <w:rtl w:val="0"/>
-        </w:rPr>
-        <w:t xml:space="preserve">7. Document Status and Evolution</w:t>
-      </w:r>
-    </w:p>
-    <w:p>
-      <w:pPr>
-        <w:rPr/>
-      </w:pPr>
-      <w:r>
-        <w:rPr>
-          <w:rtl w:val="0"/>
-        </w:rPr>
-        <w:t xml:space="preserve">This SRS is a living project document and will be continuously updated throughout Phases 1–5 of the capstone.</w:t>
-        <w:br w:type="textWrapping"/>
-      </w:r>
-    </w:p>
-    <w:p>
-      <w:pPr>
-        <w:rPr/>
-      </w:pPr>
-      <w:r>
-        <w:rPr>
-          <w:rtl w:val="0"/>
-        </w:rPr>
-        <w:t xml:space="preserve">The initial draft establishes:</w:t>
-        <w:br w:type="textWrapping"/>
-      </w:r>
-    </w:p>
-    <w:p>
-      <w:pPr>
-        <w:numPr>
-          <w:ilvl w:val="0"/>
-          <w:numId w:val="4"/>
-        </w:numPr>
-        <w:ind w:left="720" w:hanging="360"/>
-      </w:pPr>
-      <w:r>
-        <w:rPr>
-          <w:rtl w:val="0"/>
-        </w:rPr>
-        <w:t xml:space="preserve">Baseline functional and non-functional requirements</w:t>
-      </w:r>
-    </w:p>
-    <w:p>
-      <w:pPr>
-        <w:numPr>
-          <w:ilvl w:val="0"/>
-          <w:numId w:val="4"/>
-        </w:numPr>
-        <w:ind w:left="720" w:hanging="360"/>
-      </w:pPr>
-      <w:r>
-        <w:rPr>
-          <w:rtl w:val="0"/>
-        </w:rPr>
-        <w:t xml:space="preserve">Compliance alignment with Executive Order 14028</w:t>
-      </w:r>
-    </w:p>
-    <w:p>
-      <w:pPr>
-        <w:numPr>
-          <w:ilvl w:val="0"/>
-          <w:numId w:val="4"/>
-        </w:numPr>
-        <w:ind w:left="720" w:hanging="360"/>
-      </w:pPr>
-      <w:r>
-        <w:rPr>
-          <w:rtl w:val="0"/>
-        </w:rPr>
-        <w:t xml:space="preserve">Audit logging and evidence retention expectations</w:t>
-        <w:br w:type="textWrapping"/>
-      </w:r>
-    </w:p>
-    <w:p>
-      <w:pPr>
-        <w:rPr/>
-      </w:pPr>
-      <w:r>
-        <w:rPr>
-          <w:rtl w:val="0"/>
-        </w:rPr>
-        <w:t xml:space="preserve">All future refinements (architecture details, ML schema, enforcement workflows, and expanded compliance controls) will be introduced through pull requests and tracked via Git version history.</w:t>
-      </w:r>
-    </w:p>
-    <w:p>
-      <w:pPr>
-        <w:rPr/>
-      </w:pPr>
-      <w:r>
-        <w:rPr>
-          <w:rtl w:val="0"/>
-        </w:rPr>
-        <w:t xml:space="preserve"> </w:t>
-      </w:r>
+        <w:pStyle w:val="Heading2"/>
+        <w:spacing w:after="360" w:lineRule="auto"/>
+        <w:rPr/>
+      </w:pPr>
+      <w:bookmarkStart w:colFirst="0" w:colLast="0" w:name="_iijykaiwlxxu" w:id="32"/>
+      <w:bookmarkEnd w:id="32"/>
+      <w:r>
+        <w:rPr>
+          <w:rtl w:val="0"/>
+        </w:rPr>
+        <w:t xml:space="preserve">NFR-3 Model Governance</w:t>
+      </w:r>
+    </w:p>
+    <w:p>
+      <w:pPr>
+        <w:numPr>
+          <w:ilvl w:val="0"/>
+          <w:numId w:val="13"/>
+        </w:numPr>
+        <w:spacing w:after="0" w:afterAutospacing="0" w:lineRule="auto"/>
+        <w:ind w:left="720" w:hanging="360"/>
+        <w:rPr>
+          <w:u w:val="none"/>
+        </w:rPr>
+      </w:pPr>
+      <w:r>
+        <w:rPr>
+          <w:rtl w:val="0"/>
+        </w:rPr>
+        <w:t xml:space="preserve">The ML model shall be version-controlled.</w:t>
+      </w:r>
+    </w:p>
+    <w:p>
+      <w:pPr>
+        <w:numPr>
+          <w:ilvl w:val="0"/>
+          <w:numId w:val="13"/>
+        </w:numPr>
+        <w:spacing w:after="0" w:afterAutospacing="0" w:lineRule="auto"/>
+        <w:ind w:left="720" w:hanging="360"/>
+        <w:rPr>
+          <w:u w:val="none"/>
+        </w:rPr>
+      </w:pPr>
+      <w:r>
+        <w:rPr>
+          <w:rtl w:val="0"/>
+        </w:rPr>
+        <w:t xml:space="preserve">The model shall operate in inference-only mode within CI/CD.</w:t>
+      </w:r>
+    </w:p>
+    <w:p>
+      <w:pPr>
+        <w:numPr>
+          <w:ilvl w:val="0"/>
+          <w:numId w:val="13"/>
+        </w:numPr>
+        <w:spacing w:after="360" w:lineRule="auto"/>
+        <w:ind w:left="720" w:hanging="360"/>
+        <w:rPr>
+          <w:u w:val="none"/>
+        </w:rPr>
+      </w:pPr>
+      <w:r>
+        <w:rPr>
+          <w:rtl w:val="0"/>
+        </w:rPr>
+        <w:t xml:space="preserve">The system shall log the model version used per build.</w:t>
+      </w:r>
+    </w:p>
+    <w:p>
+      <w:pPr>
+        <w:spacing w:after="360" w:lineRule="auto"/>
+        <w:rPr/>
+      </w:pPr>
       <w:r>
         <w:pict>
           <v:rect style="width:0.0pt;height:1.5pt" o:hr="t" o:hrstd="t" o:hralign="center" fillcolor="#A0A0A0" stroked="f"/>
@@ -4428,6 +3806,346 @@
     </w:p>
     <w:p>
       <w:pPr>
+        <w:pStyle w:val="Heading2"/>
+        <w:rPr/>
+      </w:pPr>
+      <w:bookmarkStart w:colFirst="0" w:colLast="0" w:name="_fu8ormlowllw" w:id="33"/>
+      <w:bookmarkEnd w:id="33"/>
+      <w:r>
+        <w:rPr>
+          <w:rtl w:val="0"/>
+        </w:rPr>
+        <w:t xml:space="preserve">NFR-4 Model Transparency</w:t>
+      </w:r>
+    </w:p>
+    <w:p>
+      <w:pPr>
+        <w:rPr/>
+      </w:pPr>
+      <w:r>
+        <w:rPr>
+          <w:rtl w:val="0"/>
+        </w:rPr>
+        <w:t xml:space="preserve">The system must ensure that ML-based decisions are explainable and auditable. The decision logic must be interpretable (e.g., decision tree or rule-based explanation), and opaque black-box models are not permitted in the prototype.</w:t>
+      </w:r>
+    </w:p>
+    <w:p>
+      <w:pPr>
+        <w:spacing w:after="360" w:lineRule="auto"/>
+        <w:rPr/>
+      </w:pPr>
+      <w:r>
+        <w:pict>
+          <v:rect style="width:0.0pt;height:1.5pt" o:hr="t" o:hrstd="t" o:hralign="center" fillcolor="#A0A0A0" stroked="f"/>
+        </w:pict>
+      </w:r>
+      <w:r>
+        <w:rPr>
+          <w:rtl w:val="0"/>
+        </w:rPr>
+      </w:r>
+    </w:p>
+    <w:p>
+      <w:pPr>
+        <w:pStyle w:val="Heading2"/>
+        <w:rPr/>
+      </w:pPr>
+      <w:bookmarkStart w:colFirst="0" w:colLast="0" w:name="_1e48a2jjv5pu" w:id="34"/>
+      <w:bookmarkEnd w:id="34"/>
+      <w:r>
+        <w:rPr>
+          <w:rtl w:val="0"/>
+        </w:rPr>
+        <w:t xml:space="preserve">NFR-5 Artifact Integrity</w:t>
+      </w:r>
+    </w:p>
+    <w:p>
+      <w:pPr>
+        <w:rPr/>
+      </w:pPr>
+      <w:r>
+        <w:rPr>
+          <w:rtl w:val="0"/>
+        </w:rPr>
+        <w:t xml:space="preserve">All retained artifacts must be protected against tampering. Artifact storage must ensure integrity verification and controlled access. Integrity verification mechanisms (e.g., checksums or hash validation) must be used to ensure artifact immutability.</w:t>
+      </w:r>
+    </w:p>
+    <w:p>
+      <w:pPr>
+        <w:spacing w:after="360" w:lineRule="auto"/>
+        <w:rPr/>
+      </w:pPr>
+      <w:r>
+        <w:pict>
+          <v:rect style="width:0.0pt;height:1.5pt" o:hr="t" o:hrstd="t" o:hralign="center" fillcolor="#A0A0A0" stroked="f"/>
+        </w:pict>
+      </w:r>
+      <w:r>
+        <w:rPr>
+          <w:rtl w:val="0"/>
+        </w:rPr>
+      </w:r>
+    </w:p>
+    <w:p>
+      <w:pPr>
+        <w:pStyle w:val="Heading2"/>
+        <w:rPr/>
+      </w:pPr>
+      <w:bookmarkStart w:colFirst="0" w:colLast="0" w:name="_i39gejxftpbs" w:id="35"/>
+      <w:bookmarkEnd w:id="35"/>
+      <w:r>
+        <w:rPr>
+          <w:rtl w:val="0"/>
+        </w:rPr>
+        <w:t xml:space="preserve">NFR-6 Reproducibility</w:t>
+      </w:r>
+    </w:p>
+    <w:p>
+      <w:pPr>
+        <w:rPr/>
+      </w:pPr>
+      <w:r>
+        <w:rPr>
+          <w:rtl w:val="0"/>
+        </w:rPr>
+        <w:t xml:space="preserve">Given identical inputs (scan outputs and feature vector), the ML inference process must produce consistent classification results.</w:t>
+      </w:r>
+    </w:p>
+    <w:p>
+      <w:pPr>
+        <w:spacing w:after="360" w:lineRule="auto"/>
+        <w:rPr/>
+      </w:pPr>
+      <w:r>
+        <w:pict>
+          <v:rect style="width:0.0pt;height:1.5pt" o:hr="t" o:hrstd="t" o:hralign="center" fillcolor="#A0A0A0" stroked="f"/>
+        </w:pict>
+      </w:r>
+      <w:r>
+        <w:br w:type="page"/>
+      </w:r>
+      <w:r>
+        <w:rPr>
+          <w:rtl w:val="0"/>
+        </w:rPr>
+      </w:r>
+    </w:p>
+    <w:p>
+      <w:pPr>
+        <w:pStyle w:val="Heading2"/>
+        <w:rPr/>
+      </w:pPr>
+      <w:bookmarkStart w:colFirst="0" w:colLast="0" w:name="_qhpliy81ocf4" w:id="36"/>
+      <w:bookmarkEnd w:id="36"/>
+      <w:r>
+        <w:rPr>
+          <w:rtl w:val="0"/>
+        </w:rPr>
+        <w:t xml:space="preserve">NFR-7 Compliance – Audit Evidence</w:t>
+      </w:r>
+    </w:p>
+    <w:p>
+      <w:pPr>
+        <w:rPr/>
+      </w:pPr>
+      <w:r>
+        <w:rPr>
+          <w:rtl w:val="0"/>
+        </w:rPr>
+        <w:t xml:space="preserve">All compliance-relevant artifacts must be retained in immutable form to support audit review.</w:t>
+      </w:r>
+    </w:p>
+    <w:p>
+      <w:pPr>
+        <w:spacing w:after="360" w:lineRule="auto"/>
+        <w:rPr/>
+      </w:pPr>
+      <w:r>
+        <w:pict>
+          <v:rect style="width:0.0pt;height:1.5pt" o:hr="t" o:hrstd="t" o:hralign="center" fillcolor="#A0A0A0" stroked="f"/>
+        </w:pict>
+      </w:r>
+      <w:r>
+        <w:rPr>
+          <w:rtl w:val="0"/>
+        </w:rPr>
+      </w:r>
+    </w:p>
+    <w:p>
+      <w:pPr>
+        <w:pStyle w:val="Heading2"/>
+        <w:rPr/>
+      </w:pPr>
+      <w:bookmarkStart w:colFirst="0" w:colLast="0" w:name="_dqdli0m8dbph" w:id="37"/>
+      <w:bookmarkEnd w:id="37"/>
+      <w:r>
+        <w:rPr>
+          <w:rtl w:val="0"/>
+        </w:rPr>
+        <w:t xml:space="preserve">NFR-8 Compliance – Decision Traceability</w:t>
+      </w:r>
+    </w:p>
+    <w:p>
+      <w:pPr>
+        <w:rPr/>
+      </w:pPr>
+      <w:r>
+        <w:rPr>
+          <w:rtl w:val="0"/>
+        </w:rPr>
+        <w:t xml:space="preserve">ML-based decisions must remain explainable and traceable for governance validation.</w:t>
+      </w:r>
+    </w:p>
+    <w:p>
+      <w:pPr>
+        <w:rPr/>
+      </w:pPr>
+      <w:r>
+        <w:rPr>
+          <w:rtl w:val="0"/>
+        </w:rPr>
+      </w:r>
+    </w:p>
+    <w:p>
+      <w:pPr>
+        <w:spacing w:after="360" w:lineRule="auto"/>
+        <w:rPr/>
+      </w:pPr>
+      <w:r>
+        <w:pict>
+          <v:rect style="width:0.0pt;height:1.5pt" o:hr="t" o:hrstd="t" o:hralign="center" fillcolor="#A0A0A0" stroked="f"/>
+        </w:pict>
+      </w:r>
+      <w:r>
+        <w:rPr>
+          <w:rtl w:val="0"/>
+        </w:rPr>
+      </w:r>
+    </w:p>
+    <w:p>
+      <w:pPr>
+        <w:pStyle w:val="Heading1"/>
+        <w:rPr/>
+      </w:pPr>
+      <w:bookmarkStart w:colFirst="0" w:colLast="0" w:name="_rtfb0kx845ua" w:id="38"/>
+      <w:bookmarkEnd w:id="38"/>
+      <w:r>
+        <w:rPr>
+          <w:rtl w:val="0"/>
+        </w:rPr>
+        <w:t xml:space="preserve">5</w:t>
+      </w:r>
+      <w:r>
+        <w:rPr>
+          <w:rtl w:val="0"/>
+        </w:rPr>
+        <w:t xml:space="preserve">. Document Status and Evolution</w:t>
+      </w:r>
+    </w:p>
+    <w:p>
+      <w:pPr>
+        <w:rPr/>
+      </w:pPr>
+      <w:r>
+        <w:rPr>
+          <w:rtl w:val="0"/>
+        </w:rPr>
+        <w:t xml:space="preserve">This SRS is a living project document and will be continuously updated throughout Phases 1–5 of the capstone.</w:t>
+        <w:br w:type="textWrapping"/>
+      </w:r>
+    </w:p>
+    <w:p>
+      <w:pPr>
+        <w:rPr/>
+      </w:pPr>
+      <w:r>
+        <w:rPr>
+          <w:rtl w:val="0"/>
+        </w:rPr>
+        <w:t xml:space="preserve">The initial draft establishes:</w:t>
+        <w:br w:type="textWrapping"/>
+      </w:r>
+    </w:p>
+    <w:p>
+      <w:pPr>
+        <w:numPr>
+          <w:ilvl w:val="0"/>
+          <w:numId w:val="2"/>
+        </w:numPr>
+        <w:ind w:left="720" w:hanging="360"/>
+      </w:pPr>
+      <w:r>
+        <w:rPr>
+          <w:rtl w:val="0"/>
+        </w:rPr>
+        <w:t xml:space="preserve">Baseline functional and non-functional requirements</w:t>
+      </w:r>
+    </w:p>
+    <w:p>
+      <w:pPr>
+        <w:numPr>
+          <w:ilvl w:val="0"/>
+          <w:numId w:val="2"/>
+        </w:numPr>
+        <w:ind w:left="720" w:hanging="360"/>
+      </w:pPr>
+      <w:r>
+        <w:rPr>
+          <w:rtl w:val="0"/>
+        </w:rPr>
+        <w:t xml:space="preserve">Compliance alignment with Executive Order 14028</w:t>
+      </w:r>
+    </w:p>
+    <w:p>
+      <w:pPr>
+        <w:numPr>
+          <w:ilvl w:val="0"/>
+          <w:numId w:val="2"/>
+        </w:numPr>
+        <w:ind w:left="720" w:hanging="360"/>
+      </w:pPr>
+      <w:r>
+        <w:rPr>
+          <w:rtl w:val="0"/>
+        </w:rPr>
+        <w:t xml:space="preserve">Audit logging and evidence retention expectations</w:t>
+        <w:br w:type="textWrapping"/>
+      </w:r>
+    </w:p>
+    <w:p>
+      <w:pPr>
+        <w:rPr/>
+      </w:pPr>
+      <w:r>
+        <w:rPr>
+          <w:rtl w:val="0"/>
+        </w:rPr>
+        <w:t xml:space="preserve">All future refinements (architecture details, ML schema, enforcement workflows, and expanded compliance controls) will be introduced through pull requests and tracked via Git version history.</w:t>
+      </w:r>
+    </w:p>
+    <w:p>
+      <w:pPr>
+        <w:rPr/>
+      </w:pPr>
+      <w:r>
+        <w:rPr>
+          <w:rtl w:val="0"/>
+        </w:rPr>
+        <w:t xml:space="preserve"> </w:t>
+      </w:r>
+      <w:r>
+        <w:pict>
+          <v:rect style="width:0.0pt;height:1.5pt" o:hr="t" o:hrstd="t" o:hralign="center" fillcolor="#A0A0A0" stroked="f"/>
+        </w:pict>
+      </w:r>
+      <w:r>
+        <w:rPr>
+          <w:rtl w:val="0"/>
+        </w:rPr>
+      </w:r>
+    </w:p>
+    <w:p>
+      <w:pPr>
         <w:pStyle w:val="Heading1"/>
         <w:rPr/>
       </w:pPr>
@@ -4437,7 +4155,7 @@
         <w:rPr>
           <w:rtl w:val="0"/>
         </w:rPr>
-        <w:t xml:space="preserve">8. Planned Future Additions</w:t>
+        <w:t xml:space="preserve">6. Planned Future Additions</w:t>
       </w:r>
     </w:p>
     <w:p>
@@ -4456,7 +4174,7 @@
       <w:pPr>
         <w:numPr>
           <w:ilvl w:val="0"/>
-          <w:numId w:val="15"/>
+          <w:numId w:val="14"/>
         </w:numPr>
         <w:ind w:left="720" w:hanging="360"/>
       </w:pPr>
@@ -4471,7 +4189,7 @@
       <w:pPr>
         <w:numPr>
           <w:ilvl w:val="0"/>
-          <w:numId w:val="15"/>
+          <w:numId w:val="14"/>
         </w:numPr>
         <w:ind w:left="720" w:hanging="360"/>
       </w:pPr>
@@ -4486,7 +4204,7 @@
       <w:pPr>
         <w:numPr>
           <w:ilvl w:val="0"/>
-          <w:numId w:val="15"/>
+          <w:numId w:val="14"/>
         </w:numPr>
         <w:ind w:left="720" w:hanging="360"/>
       </w:pPr>
@@ -4501,7 +4219,7 @@
       <w:pPr>
         <w:numPr>
           <w:ilvl w:val="0"/>
-          <w:numId w:val="15"/>
+          <w:numId w:val="14"/>
         </w:numPr>
         <w:ind w:left="720" w:hanging="360"/>
       </w:pPr>
@@ -4516,7 +4234,7 @@
       <w:pPr>
         <w:numPr>
           <w:ilvl w:val="0"/>
-          <w:numId w:val="15"/>
+          <w:numId w:val="14"/>
         </w:numPr>
         <w:ind w:left="720" w:hanging="360"/>
       </w:pPr>
@@ -4790,8 +4508,8 @@
   <w:abstractNum w:abstractNumId="3">
     <w:lvl w:ilvl="0">
       <w:start w:val="1"/>
-      <w:numFmt w:val="bullet"/>
-      <w:lvlText w:val="●"/>
+      <w:numFmt w:val="decimal"/>
+      <w:lvlText w:val="%1."/>
       <w:lvlJc w:val="left"/>
       <w:pPr>
         <w:ind w:left="720" w:hanging="360"/>
@@ -4802,8 +4520,8 @@
     </w:lvl>
     <w:lvl w:ilvl="1">
       <w:start w:val="1"/>
-      <w:numFmt w:val="bullet"/>
-      <w:lvlText w:val="○"/>
+      <w:numFmt w:val="lowerLetter"/>
+      <w:lvlText w:val="%2."/>
       <w:lvlJc w:val="left"/>
       <w:pPr>
         <w:ind w:left="1440" w:hanging="360"/>
@@ -4814,8 +4532,8 @@
     </w:lvl>
     <w:lvl w:ilvl="2">
       <w:start w:val="1"/>
-      <w:numFmt w:val="bullet"/>
-      <w:lvlText w:val="■"/>
+      <w:numFmt w:val="lowerRoman"/>
+      <w:lvlText w:val="%3."/>
       <w:lvlJc w:val="left"/>
       <w:pPr>
         <w:ind w:left="2160" w:hanging="360"/>
@@ -4826,8 +4544,8 @@
     </w:lvl>
     <w:lvl w:ilvl="3">
       <w:start w:val="1"/>
-      <w:numFmt w:val="bullet"/>
-      <w:lvlText w:val="●"/>
+      <w:numFmt w:val="decimal"/>
+      <w:lvlText w:val="%4."/>
       <w:lvlJc w:val="left"/>
       <w:pPr>
         <w:ind w:left="2880" w:hanging="360"/>
@@ -4838,8 +4556,8 @@
     </w:lvl>
     <w:lvl w:ilvl="4">
       <w:start w:val="1"/>
-      <w:numFmt w:val="bullet"/>
-      <w:lvlText w:val="○"/>
+      <w:numFmt w:val="lowerLetter"/>
+      <w:lvlText w:val="%5."/>
       <w:lvlJc w:val="left"/>
       <w:pPr>
         <w:ind w:left="3600" w:hanging="360"/>
@@ -4850,8 +4568,8 @@
     </w:lvl>
     <w:lvl w:ilvl="5">
       <w:start w:val="1"/>
-      <w:numFmt w:val="bullet"/>
-      <w:lvlText w:val="■"/>
+      <w:numFmt w:val="lowerRoman"/>
+      <w:lvlText w:val="%6."/>
       <w:lvlJc w:val="left"/>
       <w:pPr>
         <w:ind w:left="4320" w:hanging="360"/>
@@ -4862,8 +4580,8 @@
     </w:lvl>
     <w:lvl w:ilvl="6">
       <w:start w:val="1"/>
-      <w:numFmt w:val="bullet"/>
-      <w:lvlText w:val="●"/>
+      <w:numFmt w:val="decimal"/>
+      <w:lvlText w:val="%7."/>
       <w:lvlJc w:val="left"/>
       <w:pPr>
         <w:ind w:left="5040" w:hanging="360"/>
@@ -4874,8 +4592,8 @@
     </w:lvl>
     <w:lvl w:ilvl="7">
       <w:start w:val="1"/>
-      <w:numFmt w:val="bullet"/>
-      <w:lvlText w:val="○"/>
+      <w:numFmt w:val="lowerLetter"/>
+      <w:lvlText w:val="%8."/>
       <w:lvlJc w:val="left"/>
       <w:pPr>
         <w:ind w:left="5760" w:hanging="360"/>
@@ -4886,8 +4604,8 @@
     </w:lvl>
     <w:lvl w:ilvl="8">
       <w:start w:val="1"/>
-      <w:numFmt w:val="bullet"/>
-      <w:lvlText w:val="■"/>
+      <w:numFmt w:val="lowerRoman"/>
+      <w:lvlText w:val="%9."/>
       <w:lvlJc w:val="left"/>
       <w:pPr>
         <w:ind w:left="6480" w:hanging="360"/>
@@ -5010,8 +4728,8 @@
   <w:abstractNum w:abstractNumId="5">
     <w:lvl w:ilvl="0">
       <w:start w:val="1"/>
-      <w:numFmt w:val="decimal"/>
-      <w:lvlText w:val="%1."/>
+      <w:numFmt w:val="bullet"/>
+      <w:lvlText w:val="●"/>
       <w:lvlJc w:val="left"/>
       <w:pPr>
         <w:ind w:left="720" w:hanging="360"/>
@@ -5022,8 +4740,8 @@
     </w:lvl>
     <w:lvl w:ilvl="1">
       <w:start w:val="1"/>
-      <w:numFmt w:val="lowerLetter"/>
-      <w:lvlText w:val="%2."/>
+      <w:numFmt w:val="bullet"/>
+      <w:lvlText w:val="●"/>
       <w:lvlJc w:val="left"/>
       <w:pPr>
         <w:ind w:left="1440" w:hanging="360"/>
@@ -5034,8 +4752,8 @@
     </w:lvl>
     <w:lvl w:ilvl="2">
       <w:start w:val="1"/>
-      <w:numFmt w:val="lowerRoman"/>
-      <w:lvlText w:val="%3."/>
+      <w:numFmt w:val="bullet"/>
+      <w:lvlText w:val="■"/>
       <w:lvlJc w:val="left"/>
       <w:pPr>
         <w:ind w:left="2160" w:hanging="360"/>
@@ -5046,8 +4764,8 @@
     </w:lvl>
     <w:lvl w:ilvl="3">
       <w:start w:val="1"/>
-      <w:numFmt w:val="decimal"/>
-      <w:lvlText w:val="%4."/>
+      <w:numFmt w:val="bullet"/>
+      <w:lvlText w:val="●"/>
       <w:lvlJc w:val="left"/>
       <w:pPr>
         <w:ind w:left="2880" w:hanging="360"/>
@@ -5058,8 +4776,8 @@
     </w:lvl>
     <w:lvl w:ilvl="4">
       <w:start w:val="1"/>
-      <w:numFmt w:val="lowerLetter"/>
-      <w:lvlText w:val="%5."/>
+      <w:numFmt w:val="bullet"/>
+      <w:lvlText w:val="○"/>
       <w:lvlJc w:val="left"/>
       <w:pPr>
         <w:ind w:left="3600" w:hanging="360"/>
@@ -5070,8 +4788,8 @@
     </w:lvl>
     <w:lvl w:ilvl="5">
       <w:start w:val="1"/>
-      <w:numFmt w:val="lowerRoman"/>
-      <w:lvlText w:val="%6."/>
+      <w:numFmt w:val="bullet"/>
+      <w:lvlText w:val="■"/>
       <w:lvlJc w:val="left"/>
       <w:pPr>
         <w:ind w:left="4320" w:hanging="360"/>
@@ -5082,8 +4800,8 @@
     </w:lvl>
     <w:lvl w:ilvl="6">
       <w:start w:val="1"/>
-      <w:numFmt w:val="decimal"/>
-      <w:lvlText w:val="%7."/>
+      <w:numFmt w:val="bullet"/>
+      <w:lvlText w:val="●"/>
       <w:lvlJc w:val="left"/>
       <w:pPr>
         <w:ind w:left="5040" w:hanging="360"/>
@@ -5094,8 +4812,8 @@
     </w:lvl>
     <w:lvl w:ilvl="7">
       <w:start w:val="1"/>
-      <w:numFmt w:val="lowerLetter"/>
-      <w:lvlText w:val="%8."/>
+      <w:numFmt w:val="bullet"/>
+      <w:lvlText w:val="○"/>
       <w:lvlJc w:val="left"/>
       <w:pPr>
         <w:ind w:left="5760" w:hanging="360"/>
@@ -5106,8 +4824,8 @@
     </w:lvl>
     <w:lvl w:ilvl="8">
       <w:start w:val="1"/>
-      <w:numFmt w:val="lowerRoman"/>
-      <w:lvlText w:val="%9."/>
+      <w:numFmt w:val="bullet"/>
+      <w:lvlText w:val="■"/>
       <w:lvlJc w:val="left"/>
       <w:pPr>
         <w:ind w:left="6480" w:hanging="360"/>
@@ -5243,7 +4961,7 @@
     <w:lvl w:ilvl="1">
       <w:start w:val="1"/>
       <w:numFmt w:val="bullet"/>
-      <w:lvlText w:val="●"/>
+      <w:lvlText w:val="○"/>
       <w:lvlJc w:val="left"/>
       <w:pPr>
         <w:ind w:left="1440" w:hanging="360"/>
@@ -5463,7 +5181,7 @@
     <w:lvl w:ilvl="1">
       <w:start w:val="1"/>
       <w:numFmt w:val="bullet"/>
-      <w:lvlText w:val="○"/>
+      <w:lvlText w:val="●"/>
       <w:lvlJc w:val="left"/>
       <w:pPr>
         <w:ind w:left="1440" w:hanging="360"/>
@@ -5573,7 +5291,7 @@
     <w:lvl w:ilvl="1">
       <w:start w:val="1"/>
       <w:numFmt w:val="bullet"/>
-      <w:lvlText w:val="●"/>
+      <w:lvlText w:val="○"/>
       <w:lvlJc w:val="left"/>
       <w:pPr>
         <w:ind w:left="1440" w:hanging="360"/>
@@ -6220,8 +5938,8 @@
   <w:abstractNum w:abstractNumId="16">
     <w:lvl w:ilvl="0">
       <w:start w:val="1"/>
-      <w:numFmt w:val="bullet"/>
-      <w:lvlText w:val="●"/>
+      <w:numFmt w:val="decimal"/>
+      <w:lvlText w:val="%1."/>
       <w:lvlJc w:val="left"/>
       <w:pPr>
         <w:ind w:left="720" w:hanging="360"/>
@@ -6232,8 +5950,8 @@
     </w:lvl>
     <w:lvl w:ilvl="1">
       <w:start w:val="1"/>
-      <w:numFmt w:val="bullet"/>
-      <w:lvlText w:val="○"/>
+      <w:numFmt w:val="lowerLetter"/>
+      <w:lvlText w:val="%2."/>
       <w:lvlJc w:val="left"/>
       <w:pPr>
         <w:ind w:left="1440" w:hanging="360"/>
@@ -6244,8 +5962,8 @@
     </w:lvl>
     <w:lvl w:ilvl="2">
       <w:start w:val="1"/>
-      <w:numFmt w:val="bullet"/>
-      <w:lvlText w:val="■"/>
+      <w:numFmt w:val="lowerRoman"/>
+      <w:lvlText w:val="%3."/>
       <w:lvlJc w:val="left"/>
       <w:pPr>
         <w:ind w:left="2160" w:hanging="360"/>
@@ -6256,8 +5974,8 @@
     </w:lvl>
     <w:lvl w:ilvl="3">
       <w:start w:val="1"/>
-      <w:numFmt w:val="bullet"/>
-      <w:lvlText w:val="●"/>
+      <w:numFmt w:val="decimal"/>
+      <w:lvlText w:val="%4."/>
       <w:lvlJc w:val="left"/>
       <w:pPr>
         <w:ind w:left="2880" w:hanging="360"/>
@@ -6268,8 +5986,8 @@
     </w:lvl>
     <w:lvl w:ilvl="4">
       <w:start w:val="1"/>
-      <w:numFmt w:val="bullet"/>
-      <w:lvlText w:val="○"/>
+      <w:numFmt w:val="lowerLetter"/>
+      <w:lvlText w:val="%5."/>
       <w:lvlJc w:val="left"/>
       <w:pPr>
         <w:ind w:left="3600" w:hanging="360"/>
@@ -6280,8 +5998,8 @@
     </w:lvl>
     <w:lvl w:ilvl="5">
       <w:start w:val="1"/>
-      <w:numFmt w:val="bullet"/>
-      <w:lvlText w:val="■"/>
+      <w:numFmt w:val="lowerRoman"/>
+      <w:lvlText w:val="%6."/>
       <w:lvlJc w:val="left"/>
       <w:pPr>
         <w:ind w:left="4320" w:hanging="360"/>
@@ -6292,8 +6010,8 @@
     </w:lvl>
     <w:lvl w:ilvl="6">
       <w:start w:val="1"/>
-      <w:numFmt w:val="bullet"/>
-      <w:lvlText w:val="●"/>
+      <w:numFmt w:val="decimal"/>
+      <w:lvlText w:val="%7."/>
       <w:lvlJc w:val="left"/>
       <w:pPr>
         <w:ind w:left="5040" w:hanging="360"/>
@@ -6304,8 +6022,8 @@
     </w:lvl>
     <w:lvl w:ilvl="7">
       <w:start w:val="1"/>
-      <w:numFmt w:val="bullet"/>
-      <w:lvlText w:val="○"/>
+      <w:numFmt w:val="lowerLetter"/>
+      <w:lvlText w:val="%8."/>
       <w:lvlJc w:val="left"/>
       <w:pPr>
         <w:ind w:left="5760" w:hanging="360"/>
@@ -6316,8 +6034,8 @@
     </w:lvl>
     <w:lvl w:ilvl="8">
       <w:start w:val="1"/>
-      <w:numFmt w:val="bullet"/>
-      <w:lvlText w:val="■"/>
+      <w:numFmt w:val="lowerRoman"/>
+      <w:lvlText w:val="%9."/>
       <w:lvlJc w:val="left"/>
       <w:pPr>
         <w:ind w:left="6480" w:hanging="360"/>
@@ -6330,8 +6048,8 @@
   <w:abstractNum w:abstractNumId="17">
     <w:lvl w:ilvl="0">
       <w:start w:val="1"/>
-      <w:numFmt w:val="decimal"/>
-      <w:lvlText w:val="%1."/>
+      <w:numFmt w:val="bullet"/>
+      <w:lvlText w:val="●"/>
       <w:lvlJc w:val="left"/>
       <w:pPr>
         <w:ind w:left="720" w:hanging="360"/>
@@ -6342,8 +6060,8 @@
     </w:lvl>
     <w:lvl w:ilvl="1">
       <w:start w:val="1"/>
-      <w:numFmt w:val="lowerLetter"/>
-      <w:lvlText w:val="%2."/>
+      <w:numFmt w:val="bullet"/>
+      <w:lvlText w:val="○"/>
       <w:lvlJc w:val="left"/>
       <w:pPr>
         <w:ind w:left="1440" w:hanging="360"/>
@@ -6354,8 +6072,8 @@
     </w:lvl>
     <w:lvl w:ilvl="2">
       <w:start w:val="1"/>
-      <w:numFmt w:val="lowerRoman"/>
-      <w:lvlText w:val="%3."/>
+      <w:numFmt w:val="bullet"/>
+      <w:lvlText w:val="■"/>
       <w:lvlJc w:val="left"/>
       <w:pPr>
         <w:ind w:left="2160" w:hanging="360"/>
@@ -6366,8 +6084,8 @@
     </w:lvl>
     <w:lvl w:ilvl="3">
       <w:start w:val="1"/>
-      <w:numFmt w:val="decimal"/>
-      <w:lvlText w:val="%4."/>
+      <w:numFmt w:val="bullet"/>
+      <w:lvlText w:val="●"/>
       <w:lvlJc w:val="left"/>
       <w:pPr>
         <w:ind w:left="2880" w:hanging="360"/>
@@ -6378,8 +6096,8 @@
     </w:lvl>
     <w:lvl w:ilvl="4">
       <w:start w:val="1"/>
-      <w:numFmt w:val="lowerLetter"/>
-      <w:lvlText w:val="%5."/>
+      <w:numFmt w:val="bullet"/>
+      <w:lvlText w:val="○"/>
       <w:lvlJc w:val="left"/>
       <w:pPr>
         <w:ind w:left="3600" w:hanging="360"/>
@@ -6390,8 +6108,8 @@
     </w:lvl>
     <w:lvl w:ilvl="5">
       <w:start w:val="1"/>
-      <w:numFmt w:val="lowerRoman"/>
-      <w:lvlText w:val="%6."/>
+      <w:numFmt w:val="bullet"/>
+      <w:lvlText w:val="■"/>
       <w:lvlJc w:val="left"/>
       <w:pPr>
         <w:ind w:left="4320" w:hanging="360"/>
@@ -6402,8 +6120,8 @@
     </w:lvl>
     <w:lvl w:ilvl="6">
       <w:start w:val="1"/>
-      <w:numFmt w:val="decimal"/>
-      <w:lvlText w:val="%7."/>
+      <w:numFmt w:val="bullet"/>
+      <w:lvlText w:val="●"/>
       <w:lvlJc w:val="left"/>
       <w:pPr>
         <w:ind w:left="5040" w:hanging="360"/>
@@ -6414,8 +6132,8 @@
     </w:lvl>
     <w:lvl w:ilvl="7">
       <w:start w:val="1"/>
-      <w:numFmt w:val="lowerLetter"/>
-      <w:lvlText w:val="%8."/>
+      <w:numFmt w:val="bullet"/>
+      <w:lvlText w:val="○"/>
       <w:lvlJc w:val="left"/>
       <w:pPr>
         <w:ind w:left="5760" w:hanging="360"/>
@@ -6426,8 +6144,8 @@
     </w:lvl>
     <w:lvl w:ilvl="8">
       <w:start w:val="1"/>
-      <w:numFmt w:val="lowerRoman"/>
-      <w:lvlText w:val="%9."/>
+      <w:numFmt w:val="bullet"/>
+      <w:lvlText w:val="■"/>
       <w:lvlJc w:val="left"/>
       <w:pPr>
         <w:ind w:left="6480" w:hanging="360"/>
@@ -6996,14 +6714,6 @@
     </w:rPr>
   </w:style>
   <w:style w:type="table" w:styleId="Table1">
-    <w:basedOn w:val="TableNormal"/>
-    <w:tblPr>
-      <w:tblStyleRowBandSize w:val="1"/>
-      <w:tblStyleColBandSize w:val="1"/>
-      <w:tblCellMar/>
-    </w:tblPr>
-  </w:style>
-  <w:style w:type="table" w:styleId="Table2">
     <w:basedOn w:val="TableNormal"/>
     <w:tblPr>
       <w:tblStyleRowBandSize w:val="1"/>

</xml_diff>